<commit_message>
Hồ sơ chất lượng: phụ lục & đà thép tuỳ chọn, quét/nhập chứng từ hàng hóa, BB hàng về / BB bàn giao / nhật ký thi công
- Phụ lục hợp đồng chỉ xuất hiện khi tick; căn cứ tự đánh lại số
- Đà thép & hạng mục phát sinh theo mục D2, vào BB kiểm tra vật liệu + lắp đặt, TT đánh lại liên tục
- Quét số C/O, C/Q, Packing List, HBL (PDF/ảnh) hoặc nhập tay
- Xuất riêng BB xác nhận hàng về, BB bàn giao (mẫu Bên Mua/Bên Bán), nhật ký thi công
- Bỏ danh sách tiêu chuẩn chung bị lặp ở mục II căn cứ pháp lý
- Kiểm thử mẫu + nhận diện chứng từ

Co-Authored-By: Claude Sonnet 5.5 <noreply@anthropic.com>
Claude-Session: https://claude.ai/code/session_013Aca6Aq9pjXkV1DmQMR7fz
</commit_message>
<xml_diff>
--- a/tools/tiendotm/hoso_chatluong_template.docx
+++ b/tools/tiendotm/hoso_chatluong_template.docx
@@ -801,69 +801,6 @@
           <w:bCs/>
         </w:rPr>
         <w:t>II. Căn cứ pháp lý và tiêu chuẩn áp dụng</w:t>
-      </w:r>
-    </w:p>
-    <w:p>
-      <w:pPr>
-        <w:spacing w:after="30" w:line="264" w:lineRule="auto"/>
-        <w:ind w:left="360" w:hanging="280"/>
-      </w:pPr>
-      <w:r>
-        <w:t>1. Luật Xây dựng số 50/2014/QH13 và các văn bản sửa đổi, bổ sung;</w:t>
-      </w:r>
-    </w:p>
-    <w:p>
-      <w:pPr>
-        <w:spacing w:after="30" w:line="264" w:lineRule="auto"/>
-        <w:ind w:left="360" w:hanging="280"/>
-      </w:pPr>
-      <w:r>
-        <w:t>2. Nghị định 06/2021/NĐ-CP ngày 26/01/2021 quy định chi tiết một số nội dung về quản lý chất lượng, thi công xây dựng và bảo trì công trình xây dựng;</w:t>
-      </w:r>
-    </w:p>
-    <w:p>
-      <w:pPr>
-        <w:spacing w:after="30" w:line="264" w:lineRule="auto"/>
-        <w:ind w:left="360" w:hanging="280"/>
-      </w:pPr>
-      <w:r>
-        <w:t>3. Thông tư 10/2021/TT-BXD ngày 25/8/2021 hướng dẫn một số điều và biện pháp thi hành Nghị định số 06/2021/NĐ-CP;</w:t>
-      </w:r>
-    </w:p>
-    <w:p>
-      <w:pPr>
-        <w:spacing w:after="30" w:line="264" w:lineRule="auto"/>
-        <w:ind w:left="360" w:hanging="280"/>
-      </w:pPr>
-      <w:r>
-        <w:t>4. Thông tư 16/2021/TT-BXD ngày 20/6/2021 về an toàn trong thi công xây dựng;</w:t>
-      </w:r>
-    </w:p>
-    <w:p>
-      <w:pPr>
-        <w:spacing w:after="30" w:line="264" w:lineRule="auto"/>
-        <w:ind w:left="360" w:hanging="280"/>
-      </w:pPr>
-      <w:r>
-        <w:t>5. TCVN 4055:2012 – Công trình xây dựng – Tổ chức thi công;</w:t>
-      </w:r>
-    </w:p>
-    <w:p>
-      <w:pPr>
-        <w:spacing w:after="30" w:line="264" w:lineRule="auto"/>
-        <w:ind w:left="360" w:hanging="280"/>
-      </w:pPr>
-      <w:r>
-        <w:t>6. TCVN 5639:1991 – Nghiệm thu thiết bị đã lắp đặt xong;</w:t>
-      </w:r>
-    </w:p>
-    <w:p>
-      <w:pPr>
-        <w:spacing w:after="30" w:line="264" w:lineRule="auto"/>
-        <w:ind w:left="360" w:hanging="280"/>
-      </w:pPr>
-      <w:r>
-        <w:t>7. TCVN 9206:2012 – Đặt thiết bị điện trong nhà ở và công trình công cộng;</w:t>
       </w:r>
     </w:p>
     <w:p>
@@ -4488,7 +4425,7 @@
                 <w:sz w:val="22"/>
                 <w:szCs w:val="22"/>
               </w:rPr>
-              <w:t>Bản gốc/sao y hợp lệ; xuất xứ Trung Quốc, sản xuất bởi nhà máy chính hãng {{NHA_SX}}</w:t>
+              <w:t>Bản gốc/sao y hợp lệ; xuất xứ {{XUAT_XU}}, sản xuất bởi nhà máy chính hãng {{NHA_SX}}. {{CT_COCQ}}</w:t>
             </w:r>
           </w:p>
         </w:tc>
@@ -4664,7 +4601,7 @@
                 <w:sz w:val="22"/>
                 <w:szCs w:val="22"/>
               </w:rPr>
-              <w:t>Khớp số kiện, số hiệu và khối lượng hàng hóa</w:t>
+              <w:t>Khớp số kiện, số hiệu và khối lượng hàng hóa. {{CT_VANDON}}</w:t>
             </w:r>
           </w:p>
         </w:tc>
@@ -4840,7 +4777,7 @@
                 <w:sz w:val="22"/>
                 <w:szCs w:val="22"/>
               </w:rPr>
-              <w:t>Bản gốc; đúng chủng loại và nguồn gốc xuất xứ thang máy</w:t>
+              <w:t>Bản gốc; đúng chủng loại và nguồn gốc xuất xứ thang máy. {{CT_GIAMDINH}}</w:t>
             </w:r>
           </w:p>
         </w:tc>
@@ -5016,7 +4953,7 @@
                 <w:sz w:val="22"/>
                 <w:szCs w:val="22"/>
               </w:rPr>
-              <w:t>Đầy đủ theo Điều 3 Hợp đồng</w:t>
+              <w:t>Đầy đủ theo Điều 3 Hợp đồng. {{CT_TOKHAI}}</w:t>
             </w:r>
           </w:p>
         </w:tc>
@@ -7251,201 +7188,12 @@
           <w:tcPr>
             <w:tcW w:w="9638" w:type="dxa"/>
             <w:gridSpan w:val="9"/>
-            <w:shd w:val="clear" w:color="auto" w:fill="F2F2F2"/>
-            <w:tcMar>
-              <w:top w:w="40" w:type="dxa"/>
-              <w:left w:w="70" w:type="dxa"/>
-              <w:bottom w:w="40" w:type="dxa"/>
-              <w:right w:w="70" w:type="dxa"/>
-            </w:tcMar>
-          </w:tcPr>
-          <w:p>
-            <w:r>
-              <w:rPr>
-                <w:b/>
-                <w:bCs/>
-                <w:sz w:val="22"/>
-                <w:szCs w:val="22"/>
-              </w:rPr>
-              <w:t>IV. Vật tư sản xuất trong nước</w:t>
-            </w:r>
-          </w:p>
-        </w:tc>
-      </w:tr>
-      <w:tr>
-        <w:tc>
-          <w:tcPr>
-            <w:tcW w:w="430" w:type="dxa"/>
-            <w:tcMar>
-              <w:top w:w="40" w:type="dxa"/>
-              <w:left w:w="70" w:type="dxa"/>
-              <w:bottom w:w="40" w:type="dxa"/>
-              <w:right w:w="70" w:type="dxa"/>
-            </w:tcMar>
-          </w:tcPr>
-          <w:p>
-            <w:pPr>
-              <w:jc w:val="center"/>
-            </w:pPr>
-            <w:r>
-              <w:rPr>
-                <w:sz w:val="22"/>
-                <w:szCs w:val="22"/>
-              </w:rPr>
-              <w:t>22</w:t>
-            </w:r>
-          </w:p>
-        </w:tc>
-        <w:tc>
-          <w:tcPr>
-            <w:tcW w:w="2500" w:type="dxa"/>
-            <w:tcMar>
-              <w:top w:w="40" w:type="dxa"/>
-              <w:left w:w="70" w:type="dxa"/>
-              <w:bottom w:w="40" w:type="dxa"/>
-              <w:right w:w="70" w:type="dxa"/>
-            </w:tcMar>
-          </w:tcPr>
-          <w:p>
-            <w:r>
-              <w:rPr>
-                <w:sz w:val="22"/>
-                <w:szCs w:val="22"/>
-              </w:rPr>
-              <w:t>Đà thép ngăn hố thang đôi</w:t>
-            </w:r>
-          </w:p>
-        </w:tc>
-        <w:tc>
-          <w:tcPr>
-            <w:tcW w:w="950" w:type="dxa"/>
-            <w:tcMar>
-              <w:top w:w="40" w:type="dxa"/>
-              <w:left w:w="70" w:type="dxa"/>
-              <w:bottom w:w="40" w:type="dxa"/>
-              <w:right w:w="70" w:type="dxa"/>
-            </w:tcMar>
-          </w:tcPr>
-          <w:p>
-            <w:pPr>
-              <w:jc w:val="center"/>
-            </w:pPr>
-            <w:r>
-              <w:rPr>
-                <w:i/>
-                <w:iCs/>
-                <w:sz w:val="22"/>
-                <w:szCs w:val="22"/>
-              </w:rPr>
-              <w:t>Đo, đối chiếu bản vẽ</w:t>
-            </w:r>
-          </w:p>
-        </w:tc>
-        <w:tc>
-          <w:tcPr>
-            <w:tcW w:w="1888" w:type="dxa"/>
-            <w:tcMar>
-              <w:top w:w="40" w:type="dxa"/>
-              <w:left w:w="70" w:type="dxa"/>
-              <w:bottom w:w="40" w:type="dxa"/>
-              <w:right w:w="70" w:type="dxa"/>
-            </w:tcMar>
-          </w:tcPr>
-          <w:p>
-            <w:r>
-              <w:rPr>
-                <w:sz w:val="22"/>
-                <w:szCs w:val="22"/>
-              </w:rPr>
-              <w:t>Kích thước 150x75x2460 mm; số lượng 14 cái; thép đúng chủng loại, đã làm sạch và sơn chống gỉ</w:t>
-            </w:r>
-          </w:p>
-        </w:tc>
-        <w:tc>
-          <w:tcPr>
-            <w:tcW w:w="950" w:type="dxa"/>
-            <w:tcMar>
-              <w:top w:w="40" w:type="dxa"/>
-              <w:left w:w="70" w:type="dxa"/>
-              <w:bottom w:w="40" w:type="dxa"/>
-              <w:right w:w="70" w:type="dxa"/>
-            </w:tcMar>
-          </w:tcPr>
-          <w:p/>
-        </w:tc>
-        <w:tc>
-          <w:tcPr>
-            <w:tcW w:w="550" w:type="dxa"/>
-            <w:tcMar>
-              <w:top w:w="40" w:type="dxa"/>
-              <w:left w:w="70" w:type="dxa"/>
-              <w:bottom w:w="40" w:type="dxa"/>
-              <w:right w:w="70" w:type="dxa"/>
-            </w:tcMar>
-            <w:vAlign w:val="center"/>
-          </w:tcPr>
-          <w:p>
-            <w:pPr>
-              <w:jc w:val="center"/>
-            </w:pPr>
-            <w:r>
-              <w:rPr>
-                <w:sz w:val="26"/>
-                <w:szCs w:val="26"/>
-              </w:rPr>
-              <w:t>□</w:t>
-            </w:r>
-          </w:p>
-        </w:tc>
-        <w:tc>
-          <w:tcPr>
-            <w:tcW w:w="750" w:type="dxa"/>
-            <w:tcMar>
-              <w:top w:w="40" w:type="dxa"/>
-              <w:left w:w="70" w:type="dxa"/>
-              <w:bottom w:w="40" w:type="dxa"/>
-              <w:right w:w="70" w:type="dxa"/>
-            </w:tcMar>
-            <w:vAlign w:val="center"/>
-          </w:tcPr>
-          <w:p>
-            <w:pPr>
-              <w:jc w:val="center"/>
-            </w:pPr>
-            <w:r>
-              <w:rPr>
-                <w:sz w:val="26"/>
-                <w:szCs w:val="26"/>
-              </w:rPr>
-              <w:t>□</w:t>
-            </w:r>
-          </w:p>
-        </w:tc>
-        <w:tc>
-          <w:tcPr>
-            <w:tcW w:w="850" w:type="dxa"/>
-            <w:tcMar>
-              <w:top w:w="40" w:type="dxa"/>
-              <w:left w:w="70" w:type="dxa"/>
-              <w:bottom w:w="40" w:type="dxa"/>
-              <w:right w:w="70" w:type="dxa"/>
-            </w:tcMar>
-            <w:vAlign w:val="center"/>
-          </w:tcPr>
-          <w:p/>
-        </w:tc>
-        <w:tc>
-          <w:tcPr>
-            <w:tcW w:w="770" w:type="dxa"/>
-            <w:tcMar>
-              <w:top w:w="40" w:type="dxa"/>
-              <w:left w:w="70" w:type="dxa"/>
-              <w:bottom w:w="40" w:type="dxa"/>
-              <w:right w:w="70" w:type="dxa"/>
-            </w:tcMar>
-            <w:vAlign w:val="center"/>
-          </w:tcPr>
-          <w:p/>
+          </w:tcPr>
+          <w:p>
+            <w:r>
+              <w:t>{{BLOCK_KT_HM}}</w:t>
+            </w:r>
+          </w:p>
         </w:tc>
       </w:tr>
     </w:tbl>
@@ -10926,1090 +10674,7 @@
                 <w:sz w:val="22"/>
                 <w:szCs w:val="22"/>
               </w:rPr>
-              <w:lastRenderedPageBreak/>
-              <w:t>II. Hệ đà thép, bản mã đỡ ray (bao gồm phát sinh theo PLHĐ số {{SO_PL}})</w:t>
-            </w:r>
-          </w:p>
-        </w:tc>
-      </w:tr>
-      <w:tr>
-        <w:tc>
-          <w:tcPr>
-            <w:tcW w:w="430" w:type="dxa"/>
-            <w:tcMar>
-              <w:top w:w="40" w:type="dxa"/>
-              <w:left w:w="70" w:type="dxa"/>
-              <w:bottom w:w="40" w:type="dxa"/>
-              <w:right w:w="70" w:type="dxa"/>
-            </w:tcMar>
-          </w:tcPr>
-          <w:p>
-            <w:pPr>
-              <w:jc w:val="center"/>
-            </w:pPr>
-            <w:r>
-              <w:rPr>
-                <w:sz w:val="22"/>
-                <w:szCs w:val="22"/>
-              </w:rPr>
-              <w:t>5</w:t>
-            </w:r>
-          </w:p>
-        </w:tc>
-        <w:tc>
-          <w:tcPr>
-            <w:tcW w:w="2500" w:type="dxa"/>
-            <w:tcMar>
-              <w:top w:w="40" w:type="dxa"/>
-              <w:left w:w="70" w:type="dxa"/>
-              <w:bottom w:w="40" w:type="dxa"/>
-              <w:right w:w="70" w:type="dxa"/>
-            </w:tcMar>
-          </w:tcPr>
-          <w:p>
-            <w:r>
-              <w:rPr>
-                <w:sz w:val="22"/>
-                <w:szCs w:val="22"/>
-              </w:rPr>
-              <w:t>Chủng loại, kích thước đà thép ngăn hố thang đôi</w:t>
-            </w:r>
-          </w:p>
-        </w:tc>
-        <w:tc>
-          <w:tcPr>
-            <w:tcW w:w="950" w:type="dxa"/>
-            <w:tcMar>
-              <w:top w:w="40" w:type="dxa"/>
-              <w:left w:w="70" w:type="dxa"/>
-              <w:bottom w:w="40" w:type="dxa"/>
-              <w:right w:w="70" w:type="dxa"/>
-            </w:tcMar>
-          </w:tcPr>
-          <w:p>
-            <w:pPr>
-              <w:jc w:val="center"/>
-            </w:pPr>
-            <w:r>
-              <w:rPr>
-                <w:i/>
-                <w:iCs/>
-                <w:sz w:val="22"/>
-                <w:szCs w:val="22"/>
-              </w:rPr>
-              <w:t>Đo, đối chiếu bản vẽ</w:t>
-            </w:r>
-          </w:p>
-        </w:tc>
-        <w:tc>
-          <w:tcPr>
-            <w:tcW w:w="1888" w:type="dxa"/>
-            <w:tcMar>
-              <w:top w:w="40" w:type="dxa"/>
-              <w:left w:w="70" w:type="dxa"/>
-              <w:bottom w:w="40" w:type="dxa"/>
-              <w:right w:w="70" w:type="dxa"/>
-            </w:tcMar>
-          </w:tcPr>
-          <w:p>
-            <w:r>
-              <w:rPr>
-                <w:sz w:val="22"/>
-                <w:szCs w:val="22"/>
-              </w:rPr>
-              <w:t>150x75x2460 mm; số lượng 14 cái</w:t>
-            </w:r>
-          </w:p>
-        </w:tc>
-        <w:tc>
-          <w:tcPr>
-            <w:tcW w:w="950" w:type="dxa"/>
-            <w:tcMar>
-              <w:top w:w="40" w:type="dxa"/>
-              <w:left w:w="70" w:type="dxa"/>
-              <w:bottom w:w="40" w:type="dxa"/>
-              <w:right w:w="70" w:type="dxa"/>
-            </w:tcMar>
-          </w:tcPr>
-          <w:p/>
-        </w:tc>
-        <w:tc>
-          <w:tcPr>
-            <w:tcW w:w="550" w:type="dxa"/>
-            <w:tcMar>
-              <w:top w:w="40" w:type="dxa"/>
-              <w:left w:w="70" w:type="dxa"/>
-              <w:bottom w:w="40" w:type="dxa"/>
-              <w:right w:w="70" w:type="dxa"/>
-            </w:tcMar>
-            <w:vAlign w:val="center"/>
-          </w:tcPr>
-          <w:p>
-            <w:pPr>
-              <w:jc w:val="center"/>
-            </w:pPr>
-            <w:r>
-              <w:rPr>
-                <w:sz w:val="26"/>
-                <w:szCs w:val="26"/>
-              </w:rPr>
-              <w:t>□</w:t>
-            </w:r>
-          </w:p>
-        </w:tc>
-        <w:tc>
-          <w:tcPr>
-            <w:tcW w:w="750" w:type="dxa"/>
-            <w:tcMar>
-              <w:top w:w="40" w:type="dxa"/>
-              <w:left w:w="70" w:type="dxa"/>
-              <w:bottom w:w="40" w:type="dxa"/>
-              <w:right w:w="70" w:type="dxa"/>
-            </w:tcMar>
-            <w:vAlign w:val="center"/>
-          </w:tcPr>
-          <w:p>
-            <w:pPr>
-              <w:jc w:val="center"/>
-            </w:pPr>
-            <w:r>
-              <w:rPr>
-                <w:sz w:val="26"/>
-                <w:szCs w:val="26"/>
-              </w:rPr>
-              <w:t>□</w:t>
-            </w:r>
-          </w:p>
-        </w:tc>
-        <w:tc>
-          <w:tcPr>
-            <w:tcW w:w="850" w:type="dxa"/>
-            <w:tcMar>
-              <w:top w:w="40" w:type="dxa"/>
-              <w:left w:w="70" w:type="dxa"/>
-              <w:bottom w:w="40" w:type="dxa"/>
-              <w:right w:w="70" w:type="dxa"/>
-            </w:tcMar>
-            <w:vAlign w:val="center"/>
-          </w:tcPr>
-          <w:p/>
-        </w:tc>
-        <w:tc>
-          <w:tcPr>
-            <w:tcW w:w="770" w:type="dxa"/>
-            <w:tcMar>
-              <w:top w:w="40" w:type="dxa"/>
-              <w:left w:w="70" w:type="dxa"/>
-              <w:bottom w:w="40" w:type="dxa"/>
-              <w:right w:w="70" w:type="dxa"/>
-            </w:tcMar>
-            <w:vAlign w:val="center"/>
-          </w:tcPr>
-          <w:p/>
-        </w:tc>
-      </w:tr>
-      <w:tr>
-        <w:tc>
-          <w:tcPr>
-            <w:tcW w:w="430" w:type="dxa"/>
-            <w:tcMar>
-              <w:top w:w="40" w:type="dxa"/>
-              <w:left w:w="70" w:type="dxa"/>
-              <w:bottom w:w="40" w:type="dxa"/>
-              <w:right w:w="70" w:type="dxa"/>
-            </w:tcMar>
-          </w:tcPr>
-          <w:p>
-            <w:pPr>
-              <w:jc w:val="center"/>
-            </w:pPr>
-            <w:r>
-              <w:rPr>
-                <w:sz w:val="22"/>
-                <w:szCs w:val="22"/>
-              </w:rPr>
-              <w:t>6</w:t>
-            </w:r>
-          </w:p>
-        </w:tc>
-        <w:tc>
-          <w:tcPr>
-            <w:tcW w:w="2500" w:type="dxa"/>
-            <w:tcMar>
-              <w:top w:w="40" w:type="dxa"/>
-              <w:left w:w="70" w:type="dxa"/>
-              <w:bottom w:w="40" w:type="dxa"/>
-              <w:right w:w="70" w:type="dxa"/>
-            </w:tcMar>
-          </w:tcPr>
-          <w:p>
-            <w:r>
-              <w:rPr>
-                <w:sz w:val="22"/>
-                <w:szCs w:val="22"/>
-              </w:rPr>
-              <w:t>Đà thép U120x55x900 liên kết giữa các cột hiện hữu cho hệ ray (phát sinh)</w:t>
-            </w:r>
-          </w:p>
-        </w:tc>
-        <w:tc>
-          <w:tcPr>
-            <w:tcW w:w="950" w:type="dxa"/>
-            <w:tcMar>
-              <w:top w:w="40" w:type="dxa"/>
-              <w:left w:w="70" w:type="dxa"/>
-              <w:bottom w:w="40" w:type="dxa"/>
-              <w:right w:w="70" w:type="dxa"/>
-            </w:tcMar>
-          </w:tcPr>
-          <w:p>
-            <w:pPr>
-              <w:jc w:val="center"/>
-            </w:pPr>
-            <w:r>
-              <w:rPr>
-                <w:i/>
-                <w:iCs/>
-                <w:sz w:val="22"/>
-                <w:szCs w:val="22"/>
-              </w:rPr>
-              <w:t>Đo, đối chiếu bản vẽ</w:t>
-            </w:r>
-          </w:p>
-        </w:tc>
-        <w:tc>
-          <w:tcPr>
-            <w:tcW w:w="1888" w:type="dxa"/>
-            <w:tcMar>
-              <w:top w:w="40" w:type="dxa"/>
-              <w:left w:w="70" w:type="dxa"/>
-              <w:bottom w:w="40" w:type="dxa"/>
-              <w:right w:w="70" w:type="dxa"/>
-            </w:tcMar>
-          </w:tcPr>
-          <w:p>
-            <w:r>
-              <w:rPr>
-                <w:sz w:val="22"/>
-                <w:szCs w:val="22"/>
-              </w:rPr>
-              <w:t>05 bộ; đúng bản vẽ PLHĐ số {{SO_PL}}</w:t>
-            </w:r>
-          </w:p>
-        </w:tc>
-        <w:tc>
-          <w:tcPr>
-            <w:tcW w:w="950" w:type="dxa"/>
-            <w:tcMar>
-              <w:top w:w="40" w:type="dxa"/>
-              <w:left w:w="70" w:type="dxa"/>
-              <w:bottom w:w="40" w:type="dxa"/>
-              <w:right w:w="70" w:type="dxa"/>
-            </w:tcMar>
-          </w:tcPr>
-          <w:p/>
-        </w:tc>
-        <w:tc>
-          <w:tcPr>
-            <w:tcW w:w="550" w:type="dxa"/>
-            <w:tcMar>
-              <w:top w:w="40" w:type="dxa"/>
-              <w:left w:w="70" w:type="dxa"/>
-              <w:bottom w:w="40" w:type="dxa"/>
-              <w:right w:w="70" w:type="dxa"/>
-            </w:tcMar>
-            <w:vAlign w:val="center"/>
-          </w:tcPr>
-          <w:p>
-            <w:pPr>
-              <w:jc w:val="center"/>
-            </w:pPr>
-            <w:r>
-              <w:rPr>
-                <w:sz w:val="26"/>
-                <w:szCs w:val="26"/>
-              </w:rPr>
-              <w:t>□</w:t>
-            </w:r>
-          </w:p>
-        </w:tc>
-        <w:tc>
-          <w:tcPr>
-            <w:tcW w:w="750" w:type="dxa"/>
-            <w:tcMar>
-              <w:top w:w="40" w:type="dxa"/>
-              <w:left w:w="70" w:type="dxa"/>
-              <w:bottom w:w="40" w:type="dxa"/>
-              <w:right w:w="70" w:type="dxa"/>
-            </w:tcMar>
-            <w:vAlign w:val="center"/>
-          </w:tcPr>
-          <w:p>
-            <w:pPr>
-              <w:jc w:val="center"/>
-            </w:pPr>
-            <w:r>
-              <w:rPr>
-                <w:sz w:val="26"/>
-                <w:szCs w:val="26"/>
-              </w:rPr>
-              <w:t>□</w:t>
-            </w:r>
-          </w:p>
-        </w:tc>
-        <w:tc>
-          <w:tcPr>
-            <w:tcW w:w="850" w:type="dxa"/>
-            <w:tcMar>
-              <w:top w:w="40" w:type="dxa"/>
-              <w:left w:w="70" w:type="dxa"/>
-              <w:bottom w:w="40" w:type="dxa"/>
-              <w:right w:w="70" w:type="dxa"/>
-            </w:tcMar>
-            <w:vAlign w:val="center"/>
-          </w:tcPr>
-          <w:p/>
-        </w:tc>
-        <w:tc>
-          <w:tcPr>
-            <w:tcW w:w="770" w:type="dxa"/>
-            <w:tcMar>
-              <w:top w:w="40" w:type="dxa"/>
-              <w:left w:w="70" w:type="dxa"/>
-              <w:bottom w:w="40" w:type="dxa"/>
-              <w:right w:w="70" w:type="dxa"/>
-            </w:tcMar>
-            <w:vAlign w:val="center"/>
-          </w:tcPr>
-          <w:p/>
-        </w:tc>
-      </w:tr>
-      <w:tr>
-        <w:tc>
-          <w:tcPr>
-            <w:tcW w:w="430" w:type="dxa"/>
-            <w:tcMar>
-              <w:top w:w="40" w:type="dxa"/>
-              <w:left w:w="70" w:type="dxa"/>
-              <w:bottom w:w="40" w:type="dxa"/>
-              <w:right w:w="70" w:type="dxa"/>
-            </w:tcMar>
-          </w:tcPr>
-          <w:p>
-            <w:pPr>
-              <w:jc w:val="center"/>
-            </w:pPr>
-            <w:r>
-              <w:rPr>
-                <w:sz w:val="22"/>
-                <w:szCs w:val="22"/>
-              </w:rPr>
-              <w:t>7</w:t>
-            </w:r>
-          </w:p>
-        </w:tc>
-        <w:tc>
-          <w:tcPr>
-            <w:tcW w:w="2500" w:type="dxa"/>
-            <w:tcMar>
-              <w:top w:w="40" w:type="dxa"/>
-              <w:left w:w="70" w:type="dxa"/>
-              <w:bottom w:w="40" w:type="dxa"/>
-              <w:right w:w="70" w:type="dxa"/>
-            </w:tcMar>
-          </w:tcPr>
-          <w:p>
-            <w:r>
-              <w:rPr>
-                <w:sz w:val="22"/>
-                <w:szCs w:val="22"/>
-              </w:rPr>
-              <w:t>Bản mã thép (gối đôn) đế cửa và đầu cửa - {{THANG2}} (phát sinh)</w:t>
-            </w:r>
-          </w:p>
-        </w:tc>
-        <w:tc>
-          <w:tcPr>
-            <w:tcW w:w="950" w:type="dxa"/>
-            <w:tcMar>
-              <w:top w:w="40" w:type="dxa"/>
-              <w:left w:w="70" w:type="dxa"/>
-              <w:bottom w:w="40" w:type="dxa"/>
-              <w:right w:w="70" w:type="dxa"/>
-            </w:tcMar>
-          </w:tcPr>
-          <w:p>
-            <w:pPr>
-              <w:jc w:val="center"/>
-            </w:pPr>
-            <w:r>
-              <w:rPr>
-                <w:i/>
-                <w:iCs/>
-                <w:sz w:val="22"/>
-                <w:szCs w:val="22"/>
-              </w:rPr>
-              <w:t>Đo, đối chiếu bản vẽ</w:t>
-            </w:r>
-          </w:p>
-        </w:tc>
-        <w:tc>
-          <w:tcPr>
-            <w:tcW w:w="1888" w:type="dxa"/>
-            <w:tcMar>
-              <w:top w:w="40" w:type="dxa"/>
-              <w:left w:w="70" w:type="dxa"/>
-              <w:bottom w:w="40" w:type="dxa"/>
-              <w:right w:w="70" w:type="dxa"/>
-            </w:tcMar>
-          </w:tcPr>
-          <w:p>
-            <w:r>
-              <w:rPr>
-                <w:sz w:val="22"/>
-                <w:szCs w:val="22"/>
-              </w:rPr>
-              <w:t>20 cái (10 đế cửa + 10 đầu cửa), thép tấm dày 5 mm</w:t>
-            </w:r>
-          </w:p>
-        </w:tc>
-        <w:tc>
-          <w:tcPr>
-            <w:tcW w:w="950" w:type="dxa"/>
-            <w:tcMar>
-              <w:top w:w="40" w:type="dxa"/>
-              <w:left w:w="70" w:type="dxa"/>
-              <w:bottom w:w="40" w:type="dxa"/>
-              <w:right w:w="70" w:type="dxa"/>
-            </w:tcMar>
-          </w:tcPr>
-          <w:p/>
-        </w:tc>
-        <w:tc>
-          <w:tcPr>
-            <w:tcW w:w="550" w:type="dxa"/>
-            <w:tcMar>
-              <w:top w:w="40" w:type="dxa"/>
-              <w:left w:w="70" w:type="dxa"/>
-              <w:bottom w:w="40" w:type="dxa"/>
-              <w:right w:w="70" w:type="dxa"/>
-            </w:tcMar>
-            <w:vAlign w:val="center"/>
-          </w:tcPr>
-          <w:p>
-            <w:pPr>
-              <w:jc w:val="center"/>
-            </w:pPr>
-            <w:r>
-              <w:rPr>
-                <w:sz w:val="26"/>
-                <w:szCs w:val="26"/>
-              </w:rPr>
-              <w:t>□</w:t>
-            </w:r>
-          </w:p>
-        </w:tc>
-        <w:tc>
-          <w:tcPr>
-            <w:tcW w:w="750" w:type="dxa"/>
-            <w:tcMar>
-              <w:top w:w="40" w:type="dxa"/>
-              <w:left w:w="70" w:type="dxa"/>
-              <w:bottom w:w="40" w:type="dxa"/>
-              <w:right w:w="70" w:type="dxa"/>
-            </w:tcMar>
-            <w:vAlign w:val="center"/>
-          </w:tcPr>
-          <w:p>
-            <w:pPr>
-              <w:jc w:val="center"/>
-            </w:pPr>
-            <w:r>
-              <w:rPr>
-                <w:sz w:val="26"/>
-                <w:szCs w:val="26"/>
-              </w:rPr>
-              <w:t>□</w:t>
-            </w:r>
-          </w:p>
-        </w:tc>
-        <w:tc>
-          <w:tcPr>
-            <w:tcW w:w="850" w:type="dxa"/>
-            <w:tcMar>
-              <w:top w:w="40" w:type="dxa"/>
-              <w:left w:w="70" w:type="dxa"/>
-              <w:bottom w:w="40" w:type="dxa"/>
-              <w:right w:w="70" w:type="dxa"/>
-            </w:tcMar>
-            <w:vAlign w:val="center"/>
-          </w:tcPr>
-          <w:p/>
-        </w:tc>
-        <w:tc>
-          <w:tcPr>
-            <w:tcW w:w="770" w:type="dxa"/>
-            <w:tcMar>
-              <w:top w:w="40" w:type="dxa"/>
-              <w:left w:w="70" w:type="dxa"/>
-              <w:bottom w:w="40" w:type="dxa"/>
-              <w:right w:w="70" w:type="dxa"/>
-            </w:tcMar>
-            <w:vAlign w:val="center"/>
-          </w:tcPr>
-          <w:p/>
-        </w:tc>
-      </w:tr>
-      <w:tr>
-        <w:tc>
-          <w:tcPr>
-            <w:tcW w:w="430" w:type="dxa"/>
-            <w:tcMar>
-              <w:top w:w="40" w:type="dxa"/>
-              <w:left w:w="70" w:type="dxa"/>
-              <w:bottom w:w="40" w:type="dxa"/>
-              <w:right w:w="70" w:type="dxa"/>
-            </w:tcMar>
-          </w:tcPr>
-          <w:p>
-            <w:pPr>
-              <w:jc w:val="center"/>
-            </w:pPr>
-            <w:r>
-              <w:rPr>
-                <w:sz w:val="22"/>
-                <w:szCs w:val="22"/>
-              </w:rPr>
-              <w:t>8</w:t>
-            </w:r>
-          </w:p>
-        </w:tc>
-        <w:tc>
-          <w:tcPr>
-            <w:tcW w:w="2500" w:type="dxa"/>
-            <w:tcMar>
-              <w:top w:w="40" w:type="dxa"/>
-              <w:left w:w="70" w:type="dxa"/>
-              <w:bottom w:w="40" w:type="dxa"/>
-              <w:right w:w="70" w:type="dxa"/>
-            </w:tcMar>
-          </w:tcPr>
-          <w:p>
-            <w:r>
-              <w:rPr>
-                <w:sz w:val="22"/>
-                <w:szCs w:val="22"/>
-              </w:rPr>
-              <w:t>Cao độ và khoảng cách giữa các đà thép bắt ray</w:t>
-            </w:r>
-          </w:p>
-        </w:tc>
-        <w:tc>
-          <w:tcPr>
-            <w:tcW w:w="950" w:type="dxa"/>
-            <w:tcMar>
-              <w:top w:w="40" w:type="dxa"/>
-              <w:left w:w="70" w:type="dxa"/>
-              <w:bottom w:w="40" w:type="dxa"/>
-              <w:right w:w="70" w:type="dxa"/>
-            </w:tcMar>
-          </w:tcPr>
-          <w:p>
-            <w:pPr>
-              <w:jc w:val="center"/>
-            </w:pPr>
-            <w:r>
-              <w:rPr>
-                <w:i/>
-                <w:iCs/>
-                <w:sz w:val="22"/>
-                <w:szCs w:val="22"/>
-              </w:rPr>
-              <w:t>Đo</w:t>
-            </w:r>
-          </w:p>
-        </w:tc>
-        <w:tc>
-          <w:tcPr>
-            <w:tcW w:w="1888" w:type="dxa"/>
-            <w:tcMar>
-              <w:top w:w="40" w:type="dxa"/>
-              <w:left w:w="70" w:type="dxa"/>
-              <w:bottom w:w="40" w:type="dxa"/>
-              <w:right w:w="70" w:type="dxa"/>
-            </w:tcMar>
-          </w:tcPr>
-          <w:p>
-            <w:r>
-              <w:rPr>
-                <w:sz w:val="22"/>
-                <w:szCs w:val="22"/>
-              </w:rPr>
-              <w:t>Khoảng cách giữa hai đà ≤ 2000 mm (Phụ lục C Hợp đồng)</w:t>
-            </w:r>
-          </w:p>
-        </w:tc>
-        <w:tc>
-          <w:tcPr>
-            <w:tcW w:w="950" w:type="dxa"/>
-            <w:tcMar>
-              <w:top w:w="40" w:type="dxa"/>
-              <w:left w:w="70" w:type="dxa"/>
-              <w:bottom w:w="40" w:type="dxa"/>
-              <w:right w:w="70" w:type="dxa"/>
-            </w:tcMar>
-          </w:tcPr>
-          <w:p/>
-        </w:tc>
-        <w:tc>
-          <w:tcPr>
-            <w:tcW w:w="550" w:type="dxa"/>
-            <w:tcMar>
-              <w:top w:w="40" w:type="dxa"/>
-              <w:left w:w="70" w:type="dxa"/>
-              <w:bottom w:w="40" w:type="dxa"/>
-              <w:right w:w="70" w:type="dxa"/>
-            </w:tcMar>
-            <w:vAlign w:val="center"/>
-          </w:tcPr>
-          <w:p>
-            <w:pPr>
-              <w:jc w:val="center"/>
-            </w:pPr>
-            <w:r>
-              <w:rPr>
-                <w:sz w:val="26"/>
-                <w:szCs w:val="26"/>
-              </w:rPr>
-              <w:t>□</w:t>
-            </w:r>
-          </w:p>
-        </w:tc>
-        <w:tc>
-          <w:tcPr>
-            <w:tcW w:w="750" w:type="dxa"/>
-            <w:tcMar>
-              <w:top w:w="40" w:type="dxa"/>
-              <w:left w:w="70" w:type="dxa"/>
-              <w:bottom w:w="40" w:type="dxa"/>
-              <w:right w:w="70" w:type="dxa"/>
-            </w:tcMar>
-            <w:vAlign w:val="center"/>
-          </w:tcPr>
-          <w:p>
-            <w:pPr>
-              <w:jc w:val="center"/>
-            </w:pPr>
-            <w:r>
-              <w:rPr>
-                <w:sz w:val="26"/>
-                <w:szCs w:val="26"/>
-              </w:rPr>
-              <w:t>□</w:t>
-            </w:r>
-          </w:p>
-        </w:tc>
-        <w:tc>
-          <w:tcPr>
-            <w:tcW w:w="850" w:type="dxa"/>
-            <w:tcMar>
-              <w:top w:w="40" w:type="dxa"/>
-              <w:left w:w="70" w:type="dxa"/>
-              <w:bottom w:w="40" w:type="dxa"/>
-              <w:right w:w="70" w:type="dxa"/>
-            </w:tcMar>
-            <w:vAlign w:val="center"/>
-          </w:tcPr>
-          <w:p/>
-        </w:tc>
-        <w:tc>
-          <w:tcPr>
-            <w:tcW w:w="770" w:type="dxa"/>
-            <w:tcMar>
-              <w:top w:w="40" w:type="dxa"/>
-              <w:left w:w="70" w:type="dxa"/>
-              <w:bottom w:w="40" w:type="dxa"/>
-              <w:right w:w="70" w:type="dxa"/>
-            </w:tcMar>
-            <w:vAlign w:val="center"/>
-          </w:tcPr>
-          <w:p/>
-        </w:tc>
-      </w:tr>
-      <w:tr>
-        <w:tc>
-          <w:tcPr>
-            <w:tcW w:w="430" w:type="dxa"/>
-            <w:tcMar>
-              <w:top w:w="40" w:type="dxa"/>
-              <w:left w:w="70" w:type="dxa"/>
-              <w:bottom w:w="40" w:type="dxa"/>
-              <w:right w:w="70" w:type="dxa"/>
-            </w:tcMar>
-          </w:tcPr>
-          <w:p>
-            <w:pPr>
-              <w:jc w:val="center"/>
-            </w:pPr>
-            <w:r>
-              <w:rPr>
-                <w:sz w:val="22"/>
-                <w:szCs w:val="22"/>
-              </w:rPr>
-              <w:t>9</w:t>
-            </w:r>
-          </w:p>
-        </w:tc>
-        <w:tc>
-          <w:tcPr>
-            <w:tcW w:w="2500" w:type="dxa"/>
-            <w:tcMar>
-              <w:top w:w="40" w:type="dxa"/>
-              <w:left w:w="70" w:type="dxa"/>
-              <w:bottom w:w="40" w:type="dxa"/>
-              <w:right w:w="70" w:type="dxa"/>
-            </w:tcMar>
-          </w:tcPr>
-          <w:p>
-            <w:r>
-              <w:rPr>
-                <w:sz w:val="22"/>
-                <w:szCs w:val="22"/>
-              </w:rPr>
-              <w:t>Mối hàn, bu lông nở liên kết đà thép với kết cấu công trình</w:t>
-            </w:r>
-          </w:p>
-        </w:tc>
-        <w:tc>
-          <w:tcPr>
-            <w:tcW w:w="950" w:type="dxa"/>
-            <w:tcMar>
-              <w:top w:w="40" w:type="dxa"/>
-              <w:left w:w="70" w:type="dxa"/>
-              <w:bottom w:w="40" w:type="dxa"/>
-              <w:right w:w="70" w:type="dxa"/>
-            </w:tcMar>
-          </w:tcPr>
-          <w:p>
-            <w:pPr>
-              <w:jc w:val="center"/>
-            </w:pPr>
-            <w:r>
-              <w:rPr>
-                <w:i/>
-                <w:iCs/>
-                <w:sz w:val="22"/>
-                <w:szCs w:val="22"/>
-              </w:rPr>
-              <w:t>Quan sát, đo</w:t>
-            </w:r>
-          </w:p>
-        </w:tc>
-        <w:tc>
-          <w:tcPr>
-            <w:tcW w:w="1888" w:type="dxa"/>
-            <w:tcMar>
-              <w:top w:w="40" w:type="dxa"/>
-              <w:left w:w="70" w:type="dxa"/>
-              <w:bottom w:w="40" w:type="dxa"/>
-              <w:right w:w="70" w:type="dxa"/>
-            </w:tcMar>
-          </w:tcPr>
-          <w:p>
-            <w:r>
-              <w:rPr>
-                <w:sz w:val="22"/>
-                <w:szCs w:val="22"/>
-              </w:rPr>
-              <w:t>Mối hàn ngấu đều, không rỗ, không nứt; đủ số lượng và mô men siết bu lông</w:t>
-            </w:r>
-          </w:p>
-        </w:tc>
-        <w:tc>
-          <w:tcPr>
-            <w:tcW w:w="950" w:type="dxa"/>
-            <w:tcMar>
-              <w:top w:w="40" w:type="dxa"/>
-              <w:left w:w="70" w:type="dxa"/>
-              <w:bottom w:w="40" w:type="dxa"/>
-              <w:right w:w="70" w:type="dxa"/>
-            </w:tcMar>
-          </w:tcPr>
-          <w:p/>
-        </w:tc>
-        <w:tc>
-          <w:tcPr>
-            <w:tcW w:w="550" w:type="dxa"/>
-            <w:tcMar>
-              <w:top w:w="40" w:type="dxa"/>
-              <w:left w:w="70" w:type="dxa"/>
-              <w:bottom w:w="40" w:type="dxa"/>
-              <w:right w:w="70" w:type="dxa"/>
-            </w:tcMar>
-            <w:vAlign w:val="center"/>
-          </w:tcPr>
-          <w:p>
-            <w:pPr>
-              <w:jc w:val="center"/>
-            </w:pPr>
-            <w:r>
-              <w:rPr>
-                <w:sz w:val="26"/>
-                <w:szCs w:val="26"/>
-              </w:rPr>
-              <w:t>□</w:t>
-            </w:r>
-          </w:p>
-        </w:tc>
-        <w:tc>
-          <w:tcPr>
-            <w:tcW w:w="750" w:type="dxa"/>
-            <w:tcMar>
-              <w:top w:w="40" w:type="dxa"/>
-              <w:left w:w="70" w:type="dxa"/>
-              <w:bottom w:w="40" w:type="dxa"/>
-              <w:right w:w="70" w:type="dxa"/>
-            </w:tcMar>
-            <w:vAlign w:val="center"/>
-          </w:tcPr>
-          <w:p>
-            <w:pPr>
-              <w:jc w:val="center"/>
-            </w:pPr>
-            <w:r>
-              <w:rPr>
-                <w:sz w:val="26"/>
-                <w:szCs w:val="26"/>
-              </w:rPr>
-              <w:t>□</w:t>
-            </w:r>
-          </w:p>
-        </w:tc>
-        <w:tc>
-          <w:tcPr>
-            <w:tcW w:w="850" w:type="dxa"/>
-            <w:tcMar>
-              <w:top w:w="40" w:type="dxa"/>
-              <w:left w:w="70" w:type="dxa"/>
-              <w:bottom w:w="40" w:type="dxa"/>
-              <w:right w:w="70" w:type="dxa"/>
-            </w:tcMar>
-            <w:vAlign w:val="center"/>
-          </w:tcPr>
-          <w:p/>
-        </w:tc>
-        <w:tc>
-          <w:tcPr>
-            <w:tcW w:w="770" w:type="dxa"/>
-            <w:tcMar>
-              <w:top w:w="40" w:type="dxa"/>
-              <w:left w:w="70" w:type="dxa"/>
-              <w:bottom w:w="40" w:type="dxa"/>
-              <w:right w:w="70" w:type="dxa"/>
-            </w:tcMar>
-            <w:vAlign w:val="center"/>
-          </w:tcPr>
-          <w:p/>
-        </w:tc>
-      </w:tr>
-      <w:tr>
-        <w:tc>
-          <w:tcPr>
-            <w:tcW w:w="430" w:type="dxa"/>
-            <w:tcMar>
-              <w:top w:w="40" w:type="dxa"/>
-              <w:left w:w="70" w:type="dxa"/>
-              <w:bottom w:w="40" w:type="dxa"/>
-              <w:right w:w="70" w:type="dxa"/>
-            </w:tcMar>
-          </w:tcPr>
-          <w:p>
-            <w:pPr>
-              <w:jc w:val="center"/>
-            </w:pPr>
-            <w:r>
-              <w:rPr>
-                <w:sz w:val="22"/>
-                <w:szCs w:val="22"/>
-              </w:rPr>
-              <w:t>10</w:t>
-            </w:r>
-          </w:p>
-        </w:tc>
-        <w:tc>
-          <w:tcPr>
-            <w:tcW w:w="2500" w:type="dxa"/>
-            <w:tcMar>
-              <w:top w:w="40" w:type="dxa"/>
-              <w:left w:w="70" w:type="dxa"/>
-              <w:bottom w:w="40" w:type="dxa"/>
-              <w:right w:w="70" w:type="dxa"/>
-            </w:tcMar>
-          </w:tcPr>
-          <w:p>
-            <w:r>
-              <w:rPr>
-                <w:sz w:val="22"/>
-                <w:szCs w:val="22"/>
-              </w:rPr>
-              <w:t>Xử lý bề mặt, sơn chống gỉ kết cấu thép</w:t>
-            </w:r>
-          </w:p>
-        </w:tc>
-        <w:tc>
-          <w:tcPr>
-            <w:tcW w:w="950" w:type="dxa"/>
-            <w:tcMar>
-              <w:top w:w="40" w:type="dxa"/>
-              <w:left w:w="70" w:type="dxa"/>
-              <w:bottom w:w="40" w:type="dxa"/>
-              <w:right w:w="70" w:type="dxa"/>
-            </w:tcMar>
-          </w:tcPr>
-          <w:p>
-            <w:pPr>
-              <w:jc w:val="center"/>
-            </w:pPr>
-            <w:r>
-              <w:rPr>
-                <w:i/>
-                <w:iCs/>
-                <w:sz w:val="22"/>
-                <w:szCs w:val="22"/>
-              </w:rPr>
-              <w:t>Quan sát</w:t>
-            </w:r>
-          </w:p>
-        </w:tc>
-        <w:tc>
-          <w:tcPr>
-            <w:tcW w:w="1888" w:type="dxa"/>
-            <w:tcMar>
-              <w:top w:w="40" w:type="dxa"/>
-              <w:left w:w="70" w:type="dxa"/>
-              <w:bottom w:w="40" w:type="dxa"/>
-              <w:right w:w="70" w:type="dxa"/>
-            </w:tcMar>
-          </w:tcPr>
-          <w:p>
-            <w:r>
-              <w:rPr>
-                <w:sz w:val="22"/>
-                <w:szCs w:val="22"/>
-              </w:rPr>
-              <w:t>Làm sạch gỉ, sơn chống gỉ tối thiểu 02 lớp phủ kín</w:t>
-            </w:r>
-          </w:p>
-        </w:tc>
-        <w:tc>
-          <w:tcPr>
-            <w:tcW w:w="950" w:type="dxa"/>
-            <w:tcMar>
-              <w:top w:w="40" w:type="dxa"/>
-              <w:left w:w="70" w:type="dxa"/>
-              <w:bottom w:w="40" w:type="dxa"/>
-              <w:right w:w="70" w:type="dxa"/>
-            </w:tcMar>
-          </w:tcPr>
-          <w:p/>
-        </w:tc>
-        <w:tc>
-          <w:tcPr>
-            <w:tcW w:w="550" w:type="dxa"/>
-            <w:tcMar>
-              <w:top w:w="40" w:type="dxa"/>
-              <w:left w:w="70" w:type="dxa"/>
-              <w:bottom w:w="40" w:type="dxa"/>
-              <w:right w:w="70" w:type="dxa"/>
-            </w:tcMar>
-            <w:vAlign w:val="center"/>
-          </w:tcPr>
-          <w:p>
-            <w:pPr>
-              <w:jc w:val="center"/>
-            </w:pPr>
-            <w:r>
-              <w:rPr>
-                <w:sz w:val="26"/>
-                <w:szCs w:val="26"/>
-              </w:rPr>
-              <w:t>□</w:t>
-            </w:r>
-          </w:p>
-        </w:tc>
-        <w:tc>
-          <w:tcPr>
-            <w:tcW w:w="750" w:type="dxa"/>
-            <w:tcMar>
-              <w:top w:w="40" w:type="dxa"/>
-              <w:left w:w="70" w:type="dxa"/>
-              <w:bottom w:w="40" w:type="dxa"/>
-              <w:right w:w="70" w:type="dxa"/>
-            </w:tcMar>
-            <w:vAlign w:val="center"/>
-          </w:tcPr>
-          <w:p>
-            <w:pPr>
-              <w:jc w:val="center"/>
-            </w:pPr>
-            <w:r>
-              <w:rPr>
-                <w:sz w:val="26"/>
-                <w:szCs w:val="26"/>
-              </w:rPr>
-              <w:t>□</w:t>
-            </w:r>
-          </w:p>
-        </w:tc>
-        <w:tc>
-          <w:tcPr>
-            <w:tcW w:w="850" w:type="dxa"/>
-            <w:tcMar>
-              <w:top w:w="40" w:type="dxa"/>
-              <w:left w:w="70" w:type="dxa"/>
-              <w:bottom w:w="40" w:type="dxa"/>
-              <w:right w:w="70" w:type="dxa"/>
-            </w:tcMar>
-            <w:vAlign w:val="center"/>
-          </w:tcPr>
-          <w:p/>
-        </w:tc>
-        <w:tc>
-          <w:tcPr>
-            <w:tcW w:w="770" w:type="dxa"/>
-            <w:tcMar>
-              <w:top w:w="40" w:type="dxa"/>
-              <w:left w:w="70" w:type="dxa"/>
-              <w:bottom w:w="40" w:type="dxa"/>
-              <w:right w:w="70" w:type="dxa"/>
-            </w:tcMar>
-            <w:vAlign w:val="center"/>
-          </w:tcPr>
-          <w:p/>
-        </w:tc>
-      </w:tr>
-      <w:tr>
-        <w:tc>
-          <w:tcPr>
-            <w:tcW w:w="9638" w:type="dxa"/>
-            <w:gridSpan w:val="9"/>
-            <w:shd w:val="clear" w:color="auto" w:fill="F2F2F2"/>
-            <w:tcMar>
-              <w:top w:w="40" w:type="dxa"/>
-              <w:left w:w="70" w:type="dxa"/>
-              <w:bottom w:w="40" w:type="dxa"/>
-              <w:right w:w="70" w:type="dxa"/>
-            </w:tcMar>
-          </w:tcPr>
-          <w:p>
-            <w:r>
-              <w:rPr>
-                <w:b/>
-                <w:bCs/>
-                <w:sz w:val="22"/>
-                <w:szCs w:val="22"/>
-              </w:rPr>
-              <w:t>III. Lắp đặt tĩnh thiết bị thang máy</w:t>
+              <w:t>II. Lắp đặt tĩnh thiết bị thang máy</w:t>
             </w:r>
           </w:p>
         </w:tc>
@@ -41295,7 +39960,7 @@
                 <w:sz w:val="22"/>
                 <w:szCs w:val="22"/>
               </w:rPr>
-              <w:t>Khối lượng thang máy {{DS_THANG}} và các hạng mục phát sinh theo PLHĐ số {{SO_PL}}</w:t>
+              <w:t>{{KL_TEN}}</w:t>
             </w:r>
           </w:p>
         </w:tc>
@@ -41340,7 +40005,7 @@
                 <w:sz w:val="22"/>
                 <w:szCs w:val="22"/>
               </w:rPr>
-              <w:t>02 thang {{NHA_SX}} 3000; 14 đà thép; 20 bản mã gối đôn; 05 bộ dầm thép U120x55x900</w:t>
+              <w:t>{{KL_SPEC}}</w:t>
             </w:r>
           </w:p>
         </w:tc>
@@ -45291,7 +43956,7 @@
                 <w:sz w:val="23"/>
                 <w:szCs w:val="23"/>
               </w:rPr>
-              <w:t xml:space="preserve">{{SO_HD}}</w:t>
+              <w:t xml:space="preserve">{{SO_HD}} và Phụ lục Hợp đồng số {{SO_PL}}</w:t>
             </w:r>
           </w:p>
         </w:tc>
@@ -45452,7 +44117,7 @@
                 <w:sz w:val="23"/>
                 <w:szCs w:val="23"/>
               </w:rPr>
-              <w:t xml:space="preserve">Chủ đầu tư</w:t>
+              <w:t xml:space="preserve">Bên Mua</w:t>
             </w:r>
           </w:p>
           <w:p>
@@ -45864,6 +44529,19 @@
         </w:tc>
       </w:tr>
     </w:tbl>
+    <w:p>
+      <w:pPr>
+        <w:spacing w:after="140"/>
+      </w:pPr>
+      <w:r>
+        <w:rPr>
+          <w:rFonts w:ascii="Times New Roman" w:cs="Times New Roman" w:eastAsia="Times New Roman" w:hAnsi="Times New Roman"/>
+          <w:sz w:val="24"/>
+          <w:szCs w:val="24"/>
+        </w:rPr>
+        <w:t xml:space="preserve"/>
+      </w:r>
+    </w:p>
     <w:p>
       <w:pPr>
         <w:spacing w:after="140"/>
@@ -45919,7 +44597,7 @@
                 <w:sz w:val="23"/>
                 <w:szCs w:val="23"/>
               </w:rPr>
-              <w:t xml:space="preserve">Nhà thầu</w:t>
+              <w:t xml:space="preserve">Bên Bán</w:t>
             </w:r>
           </w:p>
           <w:p>
@@ -45935,332 +44613,7 @@
                 <w:sz w:val="22"/>
                 <w:szCs w:val="22"/>
               </w:rPr>
-              <w:t xml:space="preserve">The Contractor</w:t>
-            </w:r>
-          </w:p>
-        </w:tc>
-        <w:tc>
-          <w:tcPr>
-            <w:tcW w:type="dxa" w:w="300"/>
-            <w:tcMar>
-              <w:top w:type="dxa" w:w="25"/>
-              <w:left w:type="dxa" w:w="85"/>
-              <w:bottom w:type="dxa" w:w="25"/>
-              <w:right w:type="dxa" w:w="85"/>
-            </w:tcMar>
-            <w:vAlign w:val="center"/>
-          </w:tcPr>
-          <w:p>
-            <w:pPr>
-              <w:spacing w:after="0" w:before="0" w:line="240"/>
-              <w:jc w:val="center"/>
-            </w:pPr>
-            <w:r>
-              <w:rPr>
-                <w:rFonts w:ascii="Times New Roman" w:cs="Times New Roman" w:eastAsia="Times New Roman" w:hAnsi="Times New Roman"/>
-                <w:b/>
-                <w:bCs/>
-                <w:sz w:val="23"/>
-                <w:szCs w:val="23"/>
-              </w:rPr>
-              <w:t xml:space="preserve">:</w:t>
-            </w:r>
-          </w:p>
-        </w:tc>
-        <w:tc>
-          <w:tcPr>
-            <w:tcW w:type="dxa" w:w="6946"/>
-            <w:tcMar>
-              <w:top w:type="dxa" w:w="25"/>
-              <w:left w:type="dxa" w:w="85"/>
-              <w:bottom w:type="dxa" w:w="25"/>
-              <w:right w:type="dxa" w:w="85"/>
-            </w:tcMar>
-            <w:vAlign w:val="center"/>
-          </w:tcPr>
-          <w:p>
-            <w:pPr>
-              <w:spacing w:after="0" w:before="0" w:line="240"/>
-              <w:jc w:val="left"/>
-            </w:pPr>
-            <w:r>
-              <w:rPr>
-                <w:rFonts w:ascii="Times New Roman" w:cs="Times New Roman" w:eastAsia="Times New Roman" w:hAnsi="Times New Roman"/>
-                <w:b/>
-                <w:bCs/>
-                <w:sz w:val="23"/>
-                <w:szCs w:val="23"/>
-              </w:rPr>
-              <w:t xml:space="preserve">{{NHA_THAU}}</w:t>
-            </w:r>
-          </w:p>
-        </w:tc>
-      </w:tr>
-      <w:tr>
-        <w:tc>
-          <w:tcPr>
-            <w:tcW w:type="dxa" w:w="2500"/>
-            <w:tcMar>
-              <w:top w:type="dxa" w:w="25"/>
-              <w:left w:type="dxa" w:w="85"/>
-              <w:bottom w:type="dxa" w:w="25"/>
-              <w:right w:type="dxa" w:w="85"/>
-            </w:tcMar>
-            <w:vAlign w:val="center"/>
-          </w:tcPr>
-          <w:p>
-            <w:pPr>
-              <w:spacing w:after="0" w:before="0" w:line="240"/>
-              <w:jc w:val="both"/>
-            </w:pPr>
-            <w:r>
-              <w:rPr>
-                <w:rFonts w:ascii="Times New Roman" w:cs="Times New Roman" w:eastAsia="Times New Roman" w:hAnsi="Times New Roman"/>
-                <w:sz w:val="23"/>
-                <w:szCs w:val="23"/>
-              </w:rPr>
-              <w:t xml:space="preserve"/>
-            </w:r>
-          </w:p>
-        </w:tc>
-        <w:tc>
-          <w:tcPr>
-            <w:tcW w:type="dxa" w:w="300"/>
-            <w:tcMar>
-              <w:top w:type="dxa" w:w="25"/>
-              <w:left w:type="dxa" w:w="85"/>
-              <w:bottom w:type="dxa" w:w="25"/>
-              <w:right w:type="dxa" w:w="85"/>
-            </w:tcMar>
-            <w:vAlign w:val="center"/>
-          </w:tcPr>
-          <w:p>
-            <w:pPr>
-              <w:spacing w:after="0" w:before="0" w:line="240"/>
-              <w:jc w:val="both"/>
-            </w:pPr>
-            <w:r>
-              <w:rPr>
-                <w:rFonts w:ascii="Times New Roman" w:cs="Times New Roman" w:eastAsia="Times New Roman" w:hAnsi="Times New Roman"/>
-                <w:sz w:val="23"/>
-                <w:szCs w:val="23"/>
-              </w:rPr>
-              <w:t xml:space="preserve"/>
-            </w:r>
-          </w:p>
-        </w:tc>
-        <w:tc>
-          <w:tcPr>
-            <w:tcW w:type="dxa" w:w="6946"/>
-            <w:tcMar>
-              <w:top w:type="dxa" w:w="25"/>
-              <w:left w:type="dxa" w:w="85"/>
-              <w:bottom w:type="dxa" w:w="25"/>
-              <w:right w:type="dxa" w:w="85"/>
-            </w:tcMar>
-            <w:vAlign w:val="center"/>
-          </w:tcPr>
-          <w:p>
-            <w:pPr>
-              <w:spacing w:after="0" w:before="0" w:line="240"/>
-              <w:jc w:val="left"/>
-            </w:pPr>
-            <w:r>
-              <w:rPr>
-                <w:rFonts w:ascii="Times New Roman" w:cs="Times New Roman" w:eastAsia="Times New Roman" w:hAnsi="Times New Roman"/>
-                <w:sz w:val="23"/>
-                <w:szCs w:val="23"/>
-              </w:rPr>
-              <w:t xml:space="preserve">{{NT_DIACHI}}</w:t>
-            </w:r>
-          </w:p>
-        </w:tc>
-      </w:tr>
-      <w:tr>
-        <w:tc>
-          <w:tcPr>
-            <w:tcW w:type="dxa" w:w="2500"/>
-            <w:tcMar>
-              <w:top w:type="dxa" w:w="25"/>
-              <w:left w:type="dxa" w:w="85"/>
-              <w:bottom w:type="dxa" w:w="25"/>
-              <w:right w:type="dxa" w:w="85"/>
-            </w:tcMar>
-            <w:vAlign w:val="center"/>
-          </w:tcPr>
-          <w:p>
-            <w:pPr>
-              <w:spacing w:after="0" w:before="0" w:line="240"/>
-              <w:jc w:val="both"/>
-            </w:pPr>
-            <w:r>
-              <w:rPr>
-                <w:rFonts w:ascii="Times New Roman" w:cs="Times New Roman" w:eastAsia="Times New Roman" w:hAnsi="Times New Roman"/>
-                <w:sz w:val="23"/>
-                <w:szCs w:val="23"/>
-              </w:rPr>
-              <w:t xml:space="preserve"/>
-            </w:r>
-          </w:p>
-        </w:tc>
-        <w:tc>
-          <w:tcPr>
-            <w:tcW w:type="dxa" w:w="300"/>
-            <w:tcMar>
-              <w:top w:type="dxa" w:w="25"/>
-              <w:left w:type="dxa" w:w="85"/>
-              <w:bottom w:type="dxa" w:w="25"/>
-              <w:right w:type="dxa" w:w="85"/>
-            </w:tcMar>
-            <w:vAlign w:val="center"/>
-          </w:tcPr>
-          <w:p>
-            <w:pPr>
-              <w:spacing w:after="0" w:before="0" w:line="240"/>
-              <w:jc w:val="both"/>
-            </w:pPr>
-            <w:r>
-              <w:rPr>
-                <w:rFonts w:ascii="Times New Roman" w:cs="Times New Roman" w:eastAsia="Times New Roman" w:hAnsi="Times New Roman"/>
-                <w:sz w:val="23"/>
-                <w:szCs w:val="23"/>
-              </w:rPr>
-              <w:t xml:space="preserve"/>
-            </w:r>
-          </w:p>
-        </w:tc>
-        <w:tc>
-          <w:tcPr>
-            <w:tcW w:type="dxa" w:w="6946"/>
-            <w:tcMar>
-              <w:top w:type="dxa" w:w="25"/>
-              <w:left w:type="dxa" w:w="85"/>
-              <w:bottom w:type="dxa" w:w="25"/>
-              <w:right w:type="dxa" w:w="85"/>
-            </w:tcMar>
-            <w:vAlign w:val="center"/>
-          </w:tcPr>
-          <w:p>
-            <w:pPr>
-              <w:spacing w:after="0" w:before="0" w:line="240"/>
-              <w:jc w:val="left"/>
-            </w:pPr>
-            <w:r>
-              <w:rPr>
-                <w:rFonts w:ascii="Times New Roman" w:cs="Times New Roman" w:eastAsia="Times New Roman" w:hAnsi="Times New Roman"/>
-                <w:sz w:val="23"/>
-                <w:szCs w:val="23"/>
-              </w:rPr>
-              <w:t xml:space="preserve">{{NT_LIENHE}}</w:t>
-            </w:r>
-          </w:p>
-          <w:p>
-            <w:pPr>
-              <w:spacing w:after="0" w:before="0" w:line="240"/>
-              <w:jc w:val="left"/>
-            </w:pPr>
-            <w:r>
-              <w:rPr>
-                <w:rFonts w:ascii="Times New Roman" w:cs="Times New Roman" w:eastAsia="Times New Roman" w:hAnsi="Times New Roman"/>
-                <w:sz w:val="23"/>
-                <w:szCs w:val="23"/>
-              </w:rPr>
-              <w:t xml:space="preserve">Đại diện: Ông </w:t>
-            </w:r>
-            <w:r>
-              <w:rPr>
-                <w:rFonts w:ascii="Times New Roman" w:cs="Times New Roman" w:eastAsia="Times New Roman" w:hAnsi="Times New Roman"/>
-                <w:b/>
-                <w:bCs/>
-                <w:sz w:val="23"/>
-                <w:szCs w:val="23"/>
-              </w:rPr>
-              <w:t xml:space="preserve">{{NT_DAIDIEN}}</w:t>
-            </w:r>
-            <w:r>
-              <w:rPr>
-                <w:rFonts w:ascii="Times New Roman" w:cs="Times New Roman" w:eastAsia="Times New Roman" w:hAnsi="Times New Roman"/>
-                <w:sz w:val="23"/>
-                <w:szCs w:val="23"/>
-              </w:rPr>
-              <w:t xml:space="preserve"> – {{NT_CHUCVU}}</w:t>
-            </w:r>
-          </w:p>
-        </w:tc>
-      </w:tr>
-    </w:tbl>
-    <w:p>
-      <w:pPr>
-        <w:spacing w:after="140"/>
-      </w:pPr>
-      <w:r>
-        <w:rPr>
-          <w:rFonts w:ascii="Times New Roman" w:cs="Times New Roman" w:eastAsia="Times New Roman" w:hAnsi="Times New Roman"/>
-          <w:sz w:val="24"/>
-          <w:szCs w:val="24"/>
-        </w:rPr>
-        <w:t xml:space="preserve"/>
-      </w:r>
-    </w:p>
-    <w:tbl>
-      <w:tblPr>
-        <w:tblW w:type="dxa" w:w="9746"/>
-        <w:tblBorders>
-          <w:top w:val="single" w:color="000000" w:sz="4"/>
-          <w:left w:val="single" w:color="000000" w:sz="4"/>
-          <w:bottom w:val="single" w:color="000000" w:sz="4"/>
-          <w:right w:val="single" w:color="000000" w:sz="4"/>
-          <w:insideH w:val="single" w:color="000000" w:sz="4"/>
-          <w:insideV w:val="single" w:color="000000" w:sz="4"/>
-        </w:tblBorders>
-      </w:tblPr>
-      <w:tblGrid>
-        <w:gridCol w:w="2500"/>
-        <w:gridCol w:w="300"/>
-        <w:gridCol w:w="6946"/>
-      </w:tblGrid>
-      <w:tr>
-        <w:tc>
-          <w:tcPr>
-            <w:tcW w:type="dxa" w:w="2500"/>
-            <w:tcMar>
-              <w:top w:type="dxa" w:w="25"/>
-              <w:left w:type="dxa" w:w="85"/>
-              <w:bottom w:type="dxa" w:w="25"/>
-              <w:right w:type="dxa" w:w="85"/>
-            </w:tcMar>
-            <w:vAlign w:val="center"/>
-          </w:tcPr>
-          <w:p>
-            <w:pPr>
-              <w:spacing w:after="0" w:before="0" w:line="240"/>
-              <w:jc w:val="left"/>
-            </w:pPr>
-            <w:r>
-              <w:rPr>
-                <w:rFonts w:ascii="Times New Roman" w:cs="Times New Roman" w:eastAsia="Times New Roman" w:hAnsi="Times New Roman"/>
-                <w:b/>
-                <w:bCs/>
-                <w:sz w:val="23"/>
-                <w:szCs w:val="23"/>
-              </w:rPr>
-              <w:t xml:space="preserve">Nhà cung cấp</w:t>
-            </w:r>
-          </w:p>
-          <w:p>
-            <w:pPr>
-              <w:spacing w:after="0" w:before="0" w:line="240"/>
-              <w:jc w:val="left"/>
-            </w:pPr>
-            <w:r>
-              <w:rPr>
-                <w:rFonts w:ascii="Times New Roman" w:cs="Times New Roman" w:eastAsia="Times New Roman" w:hAnsi="Times New Roman"/>
-                <w:i/>
-                <w:iCs/>
-                <w:sz w:val="22"/>
-                <w:szCs w:val="22"/>
-              </w:rPr>
-              <w:t xml:space="preserve">The Supplier</w:t>
+              <w:t xml:space="preserve">The Seller</w:t>
             </w:r>
           </w:p>
         </w:tc>
@@ -47750,7 +46103,7 @@
                 <w:sz w:val="22"/>
                 <w:szCs w:val="22"/>
               </w:rPr>
-              <w:t xml:space="preserve">Khác / Others: {{BBG_TRAVEL}}{{BBG_TRAVEL}}{{BBG_TRAVEL}}.....</w:t>
+              <w:t xml:space="preserve">Khác / Others: ...........................................................</w:t>
             </w:r>
           </w:p>
         </w:tc>

</xml_diff>

<commit_message>
Hồ sơ chất lượng: khối ký cân giữa, biên bản bàn giao trình bày như biên bản nghiệm thu
- Khối ký (sigTable): hàng có ít bên hơn số cột (vd biên bản kiểm tra chỉ 2 bên ký) chia đều
  bề ngang cho đúng số bên -> cân giữa trang; tiêu đề canh trên, bù dòng để tên người ký thẳng hàng
- Biên bản bàn giao (Phần X): header tên nhà thầu | Quốc hiệu – tiêu ngữ – địa danh, ngày;
  thành phần tham gia và khối ký lấy theo các bên ký biên bản nghiệm thu (thay bảng Bên Mua /
  Bên Bán cố định). Mẫu vá bằng tools_patch_bbg.py
- SW v69 để máy đã cài nhận mẫu mới

Co-Authored-By: Claude Opus 5.5 <noreply@anthropic.com>
Claude-Session: https://claude.ai/code/session_013Aca6Aq9pjXkV1DmQMR7fz
</commit_message>
<xml_diff>
--- a/tools/tiendotm/hoso_chatluong_template.docx
+++ b/tools/tiendotm/hoso_chatluong_template.docx
@@ -43696,22 +43696,128 @@
         </w:sectPr>
       </w:pPr>
     </w:p>
-    <w:p>
-      <w:pPr>
-        <w:spacing w:after="240" w:before="0" w:line="262"/>
-        <w:jc w:val="right"/>
-      </w:pPr>
-      <w:r>
-        <w:rPr>
-          <w:rFonts w:ascii="Times New Roman" w:cs="Times New Roman" w:eastAsia="Times New Roman" w:hAnsi="Times New Roman"/>
-          <w:i/>
-          <w:iCs/>
-          <w:sz w:val="24"/>
-          <w:szCs w:val="24"/>
-        </w:rPr>
-        <w:t xml:space="preserve">{{DIA_DANH}}, ngày ......... tháng ......... năm 20......</w:t>
-      </w:r>
-    </w:p>
+    <w:tbl>
+      <w:tblPr>
+        <w:tblW w:w="9638" w:type="dxa"/>
+        <w:tblBorders>
+          <w:top w:val="none" w:sz="0" w:space="0" w:color="FFFFFF"/>
+          <w:left w:val="none" w:sz="0" w:space="0" w:color="FFFFFF"/>
+          <w:bottom w:val="none" w:sz="0" w:space="0" w:color="FFFFFF"/>
+          <w:right w:val="none" w:sz="0" w:space="0" w:color="FFFFFF"/>
+          <w:insideH w:val="none" w:sz="0" w:space="0" w:color="FFFFFF"/>
+          <w:insideV w:val="none" w:sz="0" w:space="0" w:color="FFFFFF"/>
+        </w:tblBorders>
+        <w:tblCellMar>
+          <w:left w:w="10" w:type="dxa"/>
+          <w:right w:w="10" w:type="dxa"/>
+        </w:tblCellMar>
+        <w:tblLook w:val="0000" w:firstRow="0" w:lastRow="0" w:firstColumn="0" w:lastColumn="0" w:noHBand="0" w:noVBand="0"/>
+      </w:tblPr>
+      <w:tblGrid>
+        <w:gridCol w:w="4000"/>
+        <w:gridCol w:w="5638"/>
+      </w:tblGrid>
+      <w:tr>
+        <w:tc>
+          <w:tcPr>
+            <w:tcW w:w="4000" w:type="dxa"/>
+            <w:tcMar>
+              <w:top w:w="40" w:type="dxa"/>
+              <w:left w:w="70" w:type="dxa"/>
+              <w:bottom w:w="40" w:type="dxa"/>
+              <w:right w:w="70" w:type="dxa"/>
+            </w:tcMar>
+          </w:tcPr>
+          <w:p>
+            <w:pPr>
+              <w:spacing w:line="264" w:lineRule="auto"/>
+              <w:jc w:val="center"/>
+            </w:pPr>
+            <w:r>
+              <w:rPr>
+                <w:b/>
+                <w:bCs/>
+              </w:rPr>
+              <w:t>{{BLOCK_HDR}}</w:t>
+            </w:r>
+          </w:p>
+          <w:p>
+            <w:pPr>
+              <w:spacing w:line="264" w:lineRule="auto"/>
+              <w:jc w:val="center"/>
+            </w:pPr>
+            <w:r>
+              <w:rPr>
+                <w:b/>
+                <w:bCs/>
+              </w:rPr>
+              <w:t/>
+            </w:r>
+          </w:p>
+        </w:tc>
+        <w:tc>
+          <w:tcPr>
+            <w:tcW w:w="5638" w:type="dxa"/>
+            <w:tcMar>
+              <w:top w:w="40" w:type="dxa"/>
+              <w:left w:w="70" w:type="dxa"/>
+              <w:bottom w:w="40" w:type="dxa"/>
+              <w:right w:w="70" w:type="dxa"/>
+            </w:tcMar>
+          </w:tcPr>
+          <w:p>
+            <w:pPr>
+              <w:spacing w:line="264" w:lineRule="auto"/>
+              <w:jc w:val="center"/>
+            </w:pPr>
+            <w:r>
+              <w:rPr>
+                <w:b/>
+                <w:bCs/>
+              </w:rPr>
+              <w:t>CỘNG HÒA XÃ HỘI CHỦ NGHĨA VIỆT NAM</w:t>
+            </w:r>
+          </w:p>
+          <w:p>
+            <w:pPr>
+              <w:spacing w:line="264" w:lineRule="auto"/>
+              <w:jc w:val="center"/>
+            </w:pPr>
+            <w:r>
+              <w:rPr>
+                <w:b/>
+                <w:bCs/>
+                <w:u w:val="single"/>
+              </w:rPr>
+              <w:t>Độc lập – Tự do – Hạnh phúc</w:t>
+            </w:r>
+          </w:p>
+          <w:p>
+            <w:pPr>
+              <w:spacing w:line="264" w:lineRule="auto"/>
+              <w:jc w:val="center"/>
+            </w:pPr>
+            <w:r>
+              <w:t>---oo0oo---</w:t>
+            </w:r>
+          </w:p>
+          <w:p>
+            <w:pPr>
+              <w:spacing w:line="264" w:lineRule="auto"/>
+              <w:jc w:val="center"/>
+            </w:pPr>
+            <w:r>
+              <w:rPr>
+                <w:i/>
+                <w:iCs/>
+              </w:rPr>
+              <w:t>{{DIA_DANH}}, ngày ..... tháng ..... năm {{NAM}}</w:t>
+            </w:r>
+          </w:p>
+        </w:tc>
+      </w:tr>
+    </w:tbl>
+    <w:p/>
     <w:p>
       <w:pPr>
         <w:spacing w:after="0" w:before="0" w:line="262"/>
@@ -44075,798 +44181,11 @@
         <w:t xml:space="preserve"/>
       </w:r>
     </w:p>
-    <w:tbl>
-      <w:tblPr>
-        <w:tblW w:type="dxa" w:w="9746"/>
-        <w:tblBorders>
-          <w:top w:val="none" w:color="FFFFFF" w:sz="0"/>
-          <w:left w:val="none" w:color="FFFFFF" w:sz="0"/>
-          <w:bottom w:val="none" w:color="FFFFFF" w:sz="0"/>
-          <w:right w:val="none" w:color="FFFFFF" w:sz="0"/>
-          <w:insideH w:val="none" w:color="FFFFFF" w:sz="0"/>
-          <w:insideV w:val="none" w:color="FFFFFF" w:sz="0"/>
-        </w:tblBorders>
-      </w:tblPr>
-      <w:tblGrid>
-        <w:gridCol w:w="2500"/>
-        <w:gridCol w:w="300"/>
-        <w:gridCol w:w="6946"/>
-      </w:tblGrid>
-      <w:tr>
-        <w:tc>
-          <w:tcPr>
-            <w:tcW w:type="dxa" w:w="2500"/>
-            <w:tcMar>
-              <w:top w:type="dxa" w:w="25"/>
-              <w:left w:type="dxa" w:w="85"/>
-              <w:bottom w:type="dxa" w:w="25"/>
-              <w:right w:type="dxa" w:w="85"/>
-            </w:tcMar>
-            <w:vAlign w:val="center"/>
-          </w:tcPr>
-          <w:p>
-            <w:pPr>
-              <w:spacing w:after="0" w:before="0" w:line="240"/>
-              <w:jc w:val="left"/>
-            </w:pPr>
-            <w:r>
-              <w:rPr>
-                <w:rFonts w:ascii="Times New Roman" w:cs="Times New Roman" w:eastAsia="Times New Roman" w:hAnsi="Times New Roman"/>
-                <w:b/>
-                <w:bCs/>
-                <w:sz w:val="23"/>
-                <w:szCs w:val="23"/>
-              </w:rPr>
-              <w:t xml:space="preserve">Bên Mua</w:t>
-            </w:r>
-          </w:p>
-          <w:p>
-            <w:pPr>
-              <w:spacing w:after="0" w:before="0" w:line="240"/>
-              <w:jc w:val="left"/>
-            </w:pPr>
-            <w:r>
-              <w:rPr>
-                <w:rFonts w:ascii="Times New Roman" w:cs="Times New Roman" w:eastAsia="Times New Roman" w:hAnsi="Times New Roman"/>
-                <w:i/>
-                <w:iCs/>
-                <w:sz w:val="22"/>
-                <w:szCs w:val="22"/>
-              </w:rPr>
-              <w:t xml:space="preserve">The Buyer</w:t>
-            </w:r>
-          </w:p>
-        </w:tc>
-        <w:tc>
-          <w:tcPr>
-            <w:tcW w:type="dxa" w:w="300"/>
-            <w:tcMar>
-              <w:top w:type="dxa" w:w="25"/>
-              <w:left w:type="dxa" w:w="85"/>
-              <w:bottom w:type="dxa" w:w="25"/>
-              <w:right w:type="dxa" w:w="85"/>
-            </w:tcMar>
-            <w:vAlign w:val="center"/>
-          </w:tcPr>
-          <w:p>
-            <w:pPr>
-              <w:spacing w:after="0" w:before="0" w:line="240"/>
-              <w:jc w:val="center"/>
-            </w:pPr>
-            <w:r>
-              <w:rPr>
-                <w:rFonts w:ascii="Times New Roman" w:cs="Times New Roman" w:eastAsia="Times New Roman" w:hAnsi="Times New Roman"/>
-                <w:sz w:val="23"/>
-                <w:szCs w:val="23"/>
-              </w:rPr>
-              <w:t xml:space="preserve">:</w:t>
-            </w:r>
-          </w:p>
-        </w:tc>
-        <w:tc>
-          <w:tcPr>
-            <w:tcW w:type="dxa" w:w="6946"/>
-            <w:tcMar>
-              <w:top w:type="dxa" w:w="25"/>
-              <w:left w:type="dxa" w:w="85"/>
-              <w:bottom w:type="dxa" w:w="25"/>
-              <w:right w:type="dxa" w:w="85"/>
-            </w:tcMar>
-            <w:vAlign w:val="center"/>
-          </w:tcPr>
-          <w:p>
-            <w:pPr>
-              <w:spacing w:after="0" w:before="0" w:line="240"/>
-              <w:jc w:val="left"/>
-            </w:pPr>
-            <w:r>
-              <w:rPr>
-                <w:rFonts w:ascii="Times New Roman" w:cs="Times New Roman" w:eastAsia="Times New Roman" w:hAnsi="Times New Roman"/>
-                <w:b/>
-                <w:bCs/>
-                <w:sz w:val="23"/>
-                <w:szCs w:val="23"/>
-              </w:rPr>
-              <w:t xml:space="preserve">{{CHU_DAU_TU_HOA}}</w:t>
-            </w:r>
-          </w:p>
-        </w:tc>
-      </w:tr>
-      <w:tr>
-        <w:tc>
-          <w:tcPr>
-            <w:tcW w:type="dxa" w:w="2500"/>
-            <w:tcMar>
-              <w:top w:type="dxa" w:w="25"/>
-              <w:left w:type="dxa" w:w="85"/>
-              <w:bottom w:type="dxa" w:w="25"/>
-              <w:right w:type="dxa" w:w="85"/>
-            </w:tcMar>
-            <w:vAlign w:val="center"/>
-          </w:tcPr>
-          <w:p>
-            <w:pPr>
-              <w:spacing w:after="0" w:before="0" w:line="240"/>
-              <w:jc w:val="left"/>
-            </w:pPr>
-            <w:r>
-              <w:rPr>
-                <w:rFonts w:ascii="Times New Roman" w:cs="Times New Roman" w:eastAsia="Times New Roman" w:hAnsi="Times New Roman"/>
-                <w:b/>
-                <w:bCs/>
-                <w:sz w:val="23"/>
-                <w:szCs w:val="23"/>
-              </w:rPr>
-              <w:t xml:space="preserve"/>
-            </w:r>
-          </w:p>
-        </w:tc>
-        <w:tc>
-          <w:tcPr>
-            <w:tcW w:type="dxa" w:w="300"/>
-            <w:tcMar>
-              <w:top w:type="dxa" w:w="25"/>
-              <w:left w:type="dxa" w:w="85"/>
-              <w:bottom w:type="dxa" w:w="25"/>
-              <w:right w:type="dxa" w:w="85"/>
-            </w:tcMar>
-            <w:vAlign w:val="center"/>
-          </w:tcPr>
-          <w:p>
-            <w:pPr>
-              <w:spacing w:after="0" w:before="0" w:line="240"/>
-              <w:jc w:val="center"/>
-            </w:pPr>
-            <w:r>
-              <w:rPr>
-                <w:rFonts w:ascii="Times New Roman" w:cs="Times New Roman" w:eastAsia="Times New Roman" w:hAnsi="Times New Roman"/>
-                <w:sz w:val="23"/>
-                <w:szCs w:val="23"/>
-              </w:rPr>
-              <w:t xml:space="preserve">:</w:t>
-            </w:r>
-          </w:p>
-        </w:tc>
-        <w:tc>
-          <w:tcPr>
-            <w:tcW w:type="dxa" w:w="6946"/>
-            <w:tcMar>
-              <w:top w:type="dxa" w:w="25"/>
-              <w:left w:type="dxa" w:w="85"/>
-              <w:bottom w:type="dxa" w:w="25"/>
-              <w:right w:type="dxa" w:w="85"/>
-            </w:tcMar>
-            <w:vAlign w:val="center"/>
-          </w:tcPr>
-          <w:p>
-            <w:pPr>
-              <w:spacing w:after="0" w:before="0" w:line="240"/>
-              <w:jc w:val="left"/>
-            </w:pPr>
-            <w:r>
-              <w:rPr>
-                <w:rFonts w:ascii="Times New Roman" w:cs="Times New Roman" w:eastAsia="Times New Roman" w:hAnsi="Times New Roman"/>
-                <w:b w:val="false"/>
-                <w:bCs w:val="false"/>
-                <w:sz w:val="23"/>
-                <w:szCs w:val="23"/>
-              </w:rPr>
-              <w:t xml:space="preserve">{{CDT_DIACHI}}</w:t>
-            </w:r>
-          </w:p>
-        </w:tc>
-      </w:tr>
-      <w:tr>
-        <w:tc>
-          <w:tcPr>
-            <w:tcW w:type="dxa" w:w="2500"/>
-            <w:tcMar>
-              <w:top w:type="dxa" w:w="25"/>
-              <w:left w:type="dxa" w:w="85"/>
-              <w:bottom w:type="dxa" w:w="25"/>
-              <w:right w:type="dxa" w:w="85"/>
-            </w:tcMar>
-            <w:vAlign w:val="center"/>
-          </w:tcPr>
-          <w:p>
-            <w:pPr>
-              <w:spacing w:after="0" w:before="0" w:line="240"/>
-              <w:jc w:val="left"/>
-            </w:pPr>
-            <w:r>
-              <w:rPr>
-                <w:rFonts w:ascii="Times New Roman" w:cs="Times New Roman" w:eastAsia="Times New Roman" w:hAnsi="Times New Roman"/>
-                <w:b/>
-                <w:bCs/>
-                <w:sz w:val="23"/>
-                <w:szCs w:val="23"/>
-              </w:rPr>
-              <w:t xml:space="preserve">CCCD số</w:t>
-            </w:r>
-          </w:p>
-        </w:tc>
-        <w:tc>
-          <w:tcPr>
-            <w:tcW w:type="dxa" w:w="300"/>
-            <w:tcMar>
-              <w:top w:type="dxa" w:w="25"/>
-              <w:left w:type="dxa" w:w="85"/>
-              <w:bottom w:type="dxa" w:w="25"/>
-              <w:right w:type="dxa" w:w="85"/>
-            </w:tcMar>
-            <w:vAlign w:val="center"/>
-          </w:tcPr>
-          <w:p>
-            <w:pPr>
-              <w:spacing w:after="0" w:before="0" w:line="240"/>
-              <w:jc w:val="center"/>
-            </w:pPr>
-            <w:r>
-              <w:rPr>
-                <w:rFonts w:ascii="Times New Roman" w:cs="Times New Roman" w:eastAsia="Times New Roman" w:hAnsi="Times New Roman"/>
-                <w:sz w:val="23"/>
-                <w:szCs w:val="23"/>
-              </w:rPr>
-              <w:t xml:space="preserve">:</w:t>
-            </w:r>
-          </w:p>
-        </w:tc>
-        <w:tc>
-          <w:tcPr>
-            <w:tcW w:type="dxa" w:w="6946"/>
-            <w:tcMar>
-              <w:top w:type="dxa" w:w="25"/>
-              <w:left w:type="dxa" w:w="85"/>
-              <w:bottom w:type="dxa" w:w="25"/>
-              <w:right w:type="dxa" w:w="85"/>
-            </w:tcMar>
-            <w:vAlign w:val="center"/>
-          </w:tcPr>
-          <w:p>
-            <w:pPr>
-              <w:spacing w:after="0" w:before="0" w:line="240"/>
-              <w:jc w:val="left"/>
-            </w:pPr>
-            <w:r>
-              <w:rPr>
-                <w:rFonts w:ascii="Times New Roman" w:cs="Times New Roman" w:eastAsia="Times New Roman" w:hAnsi="Times New Roman"/>
-                <w:b w:val="false"/>
-                <w:bCs w:val="false"/>
-                <w:sz w:val="23"/>
-                <w:szCs w:val="23"/>
-              </w:rPr>
-              <w:t xml:space="preserve">{{CDT_GIAYTO}}</w:t>
-            </w:r>
-          </w:p>
-        </w:tc>
-      </w:tr>
-      <w:tr>
-        <w:tc>
-          <w:tcPr>
-            <w:tcW w:type="dxa" w:w="2500"/>
-            <w:tcMar>
-              <w:top w:type="dxa" w:w="25"/>
-              <w:left w:type="dxa" w:w="85"/>
-              <w:bottom w:type="dxa" w:w="25"/>
-              <w:right w:type="dxa" w:w="85"/>
-            </w:tcMar>
-            <w:vAlign w:val="center"/>
-          </w:tcPr>
-          <w:p>
-            <w:pPr>
-              <w:spacing w:after="0" w:before="0" w:line="240"/>
-              <w:jc w:val="left"/>
-            </w:pPr>
-            <w:r>
-              <w:rPr>
-                <w:rFonts w:ascii="Times New Roman" w:cs="Times New Roman" w:eastAsia="Times New Roman" w:hAnsi="Times New Roman"/>
-                <w:b/>
-                <w:bCs/>
-                <w:sz w:val="23"/>
-                <w:szCs w:val="23"/>
-              </w:rPr>
-              <w:t xml:space="preserve">Điện thoại</w:t>
-            </w:r>
-          </w:p>
-        </w:tc>
-        <w:tc>
-          <w:tcPr>
-            <w:tcW w:type="dxa" w:w="300"/>
-            <w:tcMar>
-              <w:top w:type="dxa" w:w="25"/>
-              <w:left w:type="dxa" w:w="85"/>
-              <w:bottom w:type="dxa" w:w="25"/>
-              <w:right w:type="dxa" w:w="85"/>
-            </w:tcMar>
-            <w:vAlign w:val="center"/>
-          </w:tcPr>
-          <w:p>
-            <w:pPr>
-              <w:spacing w:after="0" w:before="0" w:line="240"/>
-              <w:jc w:val="center"/>
-            </w:pPr>
-            <w:r>
-              <w:rPr>
-                <w:rFonts w:ascii="Times New Roman" w:cs="Times New Roman" w:eastAsia="Times New Roman" w:hAnsi="Times New Roman"/>
-                <w:sz w:val="23"/>
-                <w:szCs w:val="23"/>
-              </w:rPr>
-              <w:t xml:space="preserve">:</w:t>
-            </w:r>
-          </w:p>
-        </w:tc>
-        <w:tc>
-          <w:tcPr>
-            <w:tcW w:type="dxa" w:w="6946"/>
-            <w:tcMar>
-              <w:top w:type="dxa" w:w="25"/>
-              <w:left w:type="dxa" w:w="85"/>
-              <w:bottom w:type="dxa" w:w="25"/>
-              <w:right w:type="dxa" w:w="85"/>
-            </w:tcMar>
-            <w:vAlign w:val="center"/>
-          </w:tcPr>
-          <w:p>
-            <w:pPr>
-              <w:spacing w:after="0" w:before="0" w:line="240"/>
-              <w:jc w:val="left"/>
-            </w:pPr>
-            <w:r>
-              <w:rPr>
-                <w:rFonts w:ascii="Times New Roman" w:cs="Times New Roman" w:eastAsia="Times New Roman" w:hAnsi="Times New Roman"/>
-                <w:b w:val="false"/>
-                <w:bCs w:val="false"/>
-                <w:sz w:val="23"/>
-                <w:szCs w:val="23"/>
-              </w:rPr>
-              <w:t xml:space="preserve">{{CDT_DIENTHOAI}}</w:t>
-            </w:r>
-          </w:p>
-        </w:tc>
-      </w:tr>
-      <w:tr>
-        <w:tc>
-          <w:tcPr>
-            <w:tcW w:type="dxa" w:w="2500"/>
-            <w:tcMar>
-              <w:top w:type="dxa" w:w="25"/>
-              <w:left w:type="dxa" w:w="85"/>
-              <w:bottom w:type="dxa" w:w="25"/>
-              <w:right w:type="dxa" w:w="85"/>
-            </w:tcMar>
-            <w:vAlign w:val="center"/>
-          </w:tcPr>
-          <w:p>
-            <w:pPr>
-              <w:spacing w:after="0" w:before="0" w:line="240"/>
-              <w:jc w:val="left"/>
-            </w:pPr>
-            <w:r>
-              <w:rPr>
-                <w:rFonts w:ascii="Times New Roman" w:cs="Times New Roman" w:eastAsia="Times New Roman" w:hAnsi="Times New Roman"/>
-                <w:b/>
-                <w:bCs/>
-                <w:sz w:val="23"/>
-                <w:szCs w:val="23"/>
-              </w:rPr>
-              <w:t xml:space="preserve">Người đại diện</w:t>
-            </w:r>
-          </w:p>
-        </w:tc>
-        <w:tc>
-          <w:tcPr>
-            <w:tcW w:type="dxa" w:w="300"/>
-            <w:tcMar>
-              <w:top w:type="dxa" w:w="25"/>
-              <w:left w:type="dxa" w:w="85"/>
-              <w:bottom w:type="dxa" w:w="25"/>
-              <w:right w:type="dxa" w:w="85"/>
-            </w:tcMar>
-            <w:vAlign w:val="center"/>
-          </w:tcPr>
-          <w:p>
-            <w:pPr>
-              <w:spacing w:after="0" w:before="0" w:line="240"/>
-              <w:jc w:val="center"/>
-            </w:pPr>
-            <w:r>
-              <w:rPr>
-                <w:rFonts w:ascii="Times New Roman" w:cs="Times New Roman" w:eastAsia="Times New Roman" w:hAnsi="Times New Roman"/>
-                <w:sz w:val="23"/>
-                <w:szCs w:val="23"/>
-              </w:rPr>
-              <w:t xml:space="preserve">:</w:t>
-            </w:r>
-          </w:p>
-        </w:tc>
-        <w:tc>
-          <w:tcPr>
-            <w:tcW w:type="dxa" w:w="6946"/>
-            <w:tcMar>
-              <w:top w:type="dxa" w:w="25"/>
-              <w:left w:type="dxa" w:w="85"/>
-              <w:bottom w:type="dxa" w:w="25"/>
-              <w:right w:type="dxa" w:w="85"/>
-            </w:tcMar>
-            <w:vAlign w:val="center"/>
-          </w:tcPr>
-          <w:p>
-            <w:pPr>
-              <w:spacing w:after="0" w:before="0" w:line="240"/>
-              <w:jc w:val="left"/>
-            </w:pPr>
-            <w:r>
-              <w:rPr>
-                <w:rFonts w:ascii="Times New Roman" w:cs="Times New Roman" w:eastAsia="Times New Roman" w:hAnsi="Times New Roman"/>
-                <w:b w:val="false"/>
-                <w:bCs w:val="false"/>
-                <w:sz w:val="23"/>
-                <w:szCs w:val="23"/>
-              </w:rPr>
-              <w:t xml:space="preserve">{{CDT_DAIDIEN}}</w:t>
-            </w:r>
-          </w:p>
-        </w:tc>
-      </w:tr>
-    </w:tbl>
-    <w:p>
-      <w:pPr>
-        <w:spacing w:after="140"/>
-      </w:pPr>
-      <w:r>
-        <w:rPr>
-          <w:rFonts w:ascii="Times New Roman" w:cs="Times New Roman" w:eastAsia="Times New Roman" w:hAnsi="Times New Roman"/>
-          <w:sz w:val="24"/>
-          <w:szCs w:val="24"/>
-        </w:rPr>
-        <w:t xml:space="preserve"/>
-      </w:r>
-    </w:p>
-    <w:p>
-      <w:pPr>
-        <w:spacing w:after="140"/>
-      </w:pPr>
-      <w:r>
-        <w:rPr>
-          <w:rFonts w:ascii="Times New Roman" w:cs="Times New Roman" w:eastAsia="Times New Roman" w:hAnsi="Times New Roman"/>
-          <w:sz w:val="24"/>
-          <w:szCs w:val="24"/>
-        </w:rPr>
-        <w:t xml:space="preserve"/>
-      </w:r>
-    </w:p>
-    <w:tbl>
-      <w:tblPr>
-        <w:tblW w:type="dxa" w:w="9746"/>
-        <w:tblBorders>
-          <w:top w:val="single" w:color="000000" w:sz="4"/>
-          <w:left w:val="single" w:color="000000" w:sz="4"/>
-          <w:bottom w:val="single" w:color="000000" w:sz="4"/>
-          <w:right w:val="single" w:color="000000" w:sz="4"/>
-          <w:insideH w:val="single" w:color="000000" w:sz="4"/>
-          <w:insideV w:val="single" w:color="000000" w:sz="4"/>
-        </w:tblBorders>
-      </w:tblPr>
-      <w:tblGrid>
-        <w:gridCol w:w="2500"/>
-        <w:gridCol w:w="300"/>
-        <w:gridCol w:w="6946"/>
-      </w:tblGrid>
-      <w:tr>
-        <w:tc>
-          <w:tcPr>
-            <w:tcW w:type="dxa" w:w="2500"/>
-            <w:tcMar>
-              <w:top w:type="dxa" w:w="25"/>
-              <w:left w:type="dxa" w:w="85"/>
-              <w:bottom w:type="dxa" w:w="25"/>
-              <w:right w:type="dxa" w:w="85"/>
-            </w:tcMar>
-            <w:vAlign w:val="center"/>
-          </w:tcPr>
-          <w:p>
-            <w:pPr>
-              <w:spacing w:after="0" w:before="0" w:line="240"/>
-              <w:jc w:val="left"/>
-            </w:pPr>
-            <w:r>
-              <w:rPr>
-                <w:rFonts w:ascii="Times New Roman" w:cs="Times New Roman" w:eastAsia="Times New Roman" w:hAnsi="Times New Roman"/>
-                <w:b/>
-                <w:bCs/>
-                <w:sz w:val="23"/>
-                <w:szCs w:val="23"/>
-              </w:rPr>
-              <w:t xml:space="preserve">Bên Bán</w:t>
-            </w:r>
-          </w:p>
-          <w:p>
-            <w:pPr>
-              <w:spacing w:after="0" w:before="0" w:line="240"/>
-              <w:jc w:val="left"/>
-            </w:pPr>
-            <w:r>
-              <w:rPr>
-                <w:rFonts w:ascii="Times New Roman" w:cs="Times New Roman" w:eastAsia="Times New Roman" w:hAnsi="Times New Roman"/>
-                <w:i/>
-                <w:iCs/>
-                <w:sz w:val="22"/>
-                <w:szCs w:val="22"/>
-              </w:rPr>
-              <w:t xml:space="preserve">The Seller</w:t>
-            </w:r>
-          </w:p>
-        </w:tc>
-        <w:tc>
-          <w:tcPr>
-            <w:tcW w:type="dxa" w:w="300"/>
-            <w:tcMar>
-              <w:top w:type="dxa" w:w="25"/>
-              <w:left w:type="dxa" w:w="85"/>
-              <w:bottom w:type="dxa" w:w="25"/>
-              <w:right w:type="dxa" w:w="85"/>
-            </w:tcMar>
-            <w:vAlign w:val="center"/>
-          </w:tcPr>
-          <w:p>
-            <w:pPr>
-              <w:spacing w:after="0" w:before="0" w:line="240"/>
-              <w:jc w:val="center"/>
-            </w:pPr>
-            <w:r>
-              <w:rPr>
-                <w:rFonts w:ascii="Times New Roman" w:cs="Times New Roman" w:eastAsia="Times New Roman" w:hAnsi="Times New Roman"/>
-                <w:b/>
-                <w:bCs/>
-                <w:sz w:val="23"/>
-                <w:szCs w:val="23"/>
-              </w:rPr>
-              <w:t xml:space="preserve">:</w:t>
-            </w:r>
-          </w:p>
-        </w:tc>
-        <w:tc>
-          <w:tcPr>
-            <w:tcW w:type="dxa" w:w="6946"/>
-            <w:tcMar>
-              <w:top w:type="dxa" w:w="25"/>
-              <w:left w:type="dxa" w:w="85"/>
-              <w:bottom w:type="dxa" w:w="25"/>
-              <w:right w:type="dxa" w:w="85"/>
-            </w:tcMar>
-            <w:vAlign w:val="center"/>
-          </w:tcPr>
-          <w:p>
-            <w:pPr>
-              <w:spacing w:after="0" w:before="0" w:line="240"/>
-              <w:jc w:val="left"/>
-            </w:pPr>
-            <w:r>
-              <w:rPr>
-                <w:rFonts w:ascii="Times New Roman" w:cs="Times New Roman" w:eastAsia="Times New Roman" w:hAnsi="Times New Roman"/>
-                <w:b/>
-                <w:bCs/>
-                <w:sz w:val="23"/>
-                <w:szCs w:val="23"/>
-              </w:rPr>
-              <w:t xml:space="preserve">{{NHA_THAU}}</w:t>
-            </w:r>
-          </w:p>
-        </w:tc>
-      </w:tr>
-      <w:tr>
-        <w:tc>
-          <w:tcPr>
-            <w:tcW w:type="dxa" w:w="2500"/>
-            <w:tcMar>
-              <w:top w:type="dxa" w:w="25"/>
-              <w:left w:type="dxa" w:w="85"/>
-              <w:bottom w:type="dxa" w:w="25"/>
-              <w:right w:type="dxa" w:w="85"/>
-            </w:tcMar>
-            <w:vAlign w:val="center"/>
-          </w:tcPr>
-          <w:p>
-            <w:pPr>
-              <w:spacing w:after="0" w:before="0" w:line="240"/>
-              <w:jc w:val="both"/>
-            </w:pPr>
-            <w:r>
-              <w:rPr>
-                <w:rFonts w:ascii="Times New Roman" w:cs="Times New Roman" w:eastAsia="Times New Roman" w:hAnsi="Times New Roman"/>
-                <w:sz w:val="23"/>
-                <w:szCs w:val="23"/>
-              </w:rPr>
-              <w:t xml:space="preserve"/>
-            </w:r>
-          </w:p>
-        </w:tc>
-        <w:tc>
-          <w:tcPr>
-            <w:tcW w:type="dxa" w:w="300"/>
-            <w:tcMar>
-              <w:top w:type="dxa" w:w="25"/>
-              <w:left w:type="dxa" w:w="85"/>
-              <w:bottom w:type="dxa" w:w="25"/>
-              <w:right w:type="dxa" w:w="85"/>
-            </w:tcMar>
-            <w:vAlign w:val="center"/>
-          </w:tcPr>
-          <w:p>
-            <w:pPr>
-              <w:spacing w:after="0" w:before="0" w:line="240"/>
-              <w:jc w:val="both"/>
-            </w:pPr>
-            <w:r>
-              <w:rPr>
-                <w:rFonts w:ascii="Times New Roman" w:cs="Times New Roman" w:eastAsia="Times New Roman" w:hAnsi="Times New Roman"/>
-                <w:sz w:val="23"/>
-                <w:szCs w:val="23"/>
-              </w:rPr>
-              <w:t xml:space="preserve"/>
-            </w:r>
-          </w:p>
-        </w:tc>
-        <w:tc>
-          <w:tcPr>
-            <w:tcW w:type="dxa" w:w="6946"/>
-            <w:tcMar>
-              <w:top w:type="dxa" w:w="25"/>
-              <w:left w:type="dxa" w:w="85"/>
-              <w:bottom w:type="dxa" w:w="25"/>
-              <w:right w:type="dxa" w:w="85"/>
-            </w:tcMar>
-            <w:vAlign w:val="center"/>
-          </w:tcPr>
-          <w:p>
-            <w:pPr>
-              <w:spacing w:after="0" w:before="0" w:line="240"/>
-              <w:jc w:val="left"/>
-            </w:pPr>
-            <w:r>
-              <w:rPr>
-                <w:rFonts w:ascii="Times New Roman" w:cs="Times New Roman" w:eastAsia="Times New Roman" w:hAnsi="Times New Roman"/>
-                <w:sz w:val="23"/>
-                <w:szCs w:val="23"/>
-              </w:rPr>
-              <w:t xml:space="preserve">{{NT_DIACHI}}</w:t>
-            </w:r>
-          </w:p>
-        </w:tc>
-      </w:tr>
-      <w:tr>
-        <w:tc>
-          <w:tcPr>
-            <w:tcW w:type="dxa" w:w="2500"/>
-            <w:tcMar>
-              <w:top w:type="dxa" w:w="25"/>
-              <w:left w:type="dxa" w:w="85"/>
-              <w:bottom w:type="dxa" w:w="25"/>
-              <w:right w:type="dxa" w:w="85"/>
-            </w:tcMar>
-            <w:vAlign w:val="center"/>
-          </w:tcPr>
-          <w:p>
-            <w:pPr>
-              <w:spacing w:after="0" w:before="0" w:line="240"/>
-              <w:jc w:val="both"/>
-            </w:pPr>
-            <w:r>
-              <w:rPr>
-                <w:rFonts w:ascii="Times New Roman" w:cs="Times New Roman" w:eastAsia="Times New Roman" w:hAnsi="Times New Roman"/>
-                <w:sz w:val="23"/>
-                <w:szCs w:val="23"/>
-              </w:rPr>
-              <w:t xml:space="preserve"/>
-            </w:r>
-          </w:p>
-        </w:tc>
-        <w:tc>
-          <w:tcPr>
-            <w:tcW w:type="dxa" w:w="300"/>
-            <w:tcMar>
-              <w:top w:type="dxa" w:w="25"/>
-              <w:left w:type="dxa" w:w="85"/>
-              <w:bottom w:type="dxa" w:w="25"/>
-              <w:right w:type="dxa" w:w="85"/>
-            </w:tcMar>
-            <w:vAlign w:val="center"/>
-          </w:tcPr>
-          <w:p>
-            <w:pPr>
-              <w:spacing w:after="0" w:before="0" w:line="240"/>
-              <w:jc w:val="both"/>
-            </w:pPr>
-            <w:r>
-              <w:rPr>
-                <w:rFonts w:ascii="Times New Roman" w:cs="Times New Roman" w:eastAsia="Times New Roman" w:hAnsi="Times New Roman"/>
-                <w:sz w:val="23"/>
-                <w:szCs w:val="23"/>
-              </w:rPr>
-              <w:t xml:space="preserve"/>
-            </w:r>
-          </w:p>
-        </w:tc>
-        <w:tc>
-          <w:tcPr>
-            <w:tcW w:type="dxa" w:w="6946"/>
-            <w:tcMar>
-              <w:top w:type="dxa" w:w="25"/>
-              <w:left w:type="dxa" w:w="85"/>
-              <w:bottom w:type="dxa" w:w="25"/>
-              <w:right w:type="dxa" w:w="85"/>
-            </w:tcMar>
-            <w:vAlign w:val="center"/>
-          </w:tcPr>
-          <w:p>
-            <w:pPr>
-              <w:spacing w:after="0" w:before="0" w:line="240"/>
-              <w:jc w:val="left"/>
-            </w:pPr>
-            <w:r>
-              <w:rPr>
-                <w:rFonts w:ascii="Times New Roman" w:cs="Times New Roman" w:eastAsia="Times New Roman" w:hAnsi="Times New Roman"/>
-                <w:sz w:val="23"/>
-                <w:szCs w:val="23"/>
-              </w:rPr>
-              <w:t xml:space="preserve">{{NT_LIENHE}}</w:t>
-            </w:r>
-          </w:p>
-          <w:p>
-            <w:pPr>
-              <w:spacing w:after="0" w:before="0" w:line="240"/>
-              <w:jc w:val="left"/>
-            </w:pPr>
-            <w:r>
-              <w:rPr>
-                <w:rFonts w:ascii="Times New Roman" w:cs="Times New Roman" w:eastAsia="Times New Roman" w:hAnsi="Times New Roman"/>
-                <w:sz w:val="23"/>
-                <w:szCs w:val="23"/>
-              </w:rPr>
-              <w:t xml:space="preserve">Đại diện: Ông </w:t>
-            </w:r>
-            <w:r>
-              <w:rPr>
-                <w:rFonts w:ascii="Times New Roman" w:cs="Times New Roman" w:eastAsia="Times New Roman" w:hAnsi="Times New Roman"/>
-                <w:b/>
-                <w:bCs/>
-                <w:sz w:val="23"/>
-                <w:szCs w:val="23"/>
-              </w:rPr>
-              <w:t xml:space="preserve">{{NT_DAIDIEN}}</w:t>
-            </w:r>
-            <w:r>
-              <w:rPr>
-                <w:rFonts w:ascii="Times New Roman" w:cs="Times New Roman" w:eastAsia="Times New Roman" w:hAnsi="Times New Roman"/>
-                <w:sz w:val="23"/>
-                <w:szCs w:val="23"/>
-              </w:rPr>
-              <w:t xml:space="preserve"> – {{NT_CHUCVU}}</w:t>
-            </w:r>
-          </w:p>
-        </w:tc>
-      </w:tr>
-    </w:tbl>
+    <w:p>
+      <w:r>
+        <w:t>{{BLOCK_TP_BBG}}</w:t>
+      </w:r>
+    </w:p>
     <w:p>
       <w:pPr>
         <w:spacing w:after="160"/>
@@ -46381,284 +45700,11 @@
         <w:t xml:space="preserve">This Certificate is written in 2 (Two) copies, each party keeps 1 (One) copy. Vietnamese version shall prevail to be used for the purpose of interpretation.</w:t>
       </w:r>
     </w:p>
-    <w:tbl>
-      <w:tblPr>
-        <w:tblW w:type="dxa" w:w="9746"/>
-        <w:tblBorders>
-          <w:top w:val="single" w:color="000000" w:sz="4"/>
-          <w:left w:val="single" w:color="000000" w:sz="4"/>
-          <w:bottom w:val="single" w:color="000000" w:sz="4"/>
-          <w:right w:val="single" w:color="000000" w:sz="4"/>
-          <w:insideH w:val="single" w:color="000000" w:sz="4"/>
-          <w:insideV w:val="single" w:color="000000" w:sz="4"/>
-        </w:tblBorders>
-      </w:tblPr>
-      <w:tblGrid>
-        <w:gridCol w:w="4873"/>
-        <w:gridCol w:w="4873"/>
-      </w:tblGrid>
-      <w:tr>
-        <w:trPr>
-          <w:cantSplit/>
-        </w:trPr>
-        <w:tc>
-          <w:tcPr>
-            <w:tcW w:type="dxa" w:w="4873"/>
-            <w:tcMar>
-              <w:top w:type="dxa" w:w="25"/>
-              <w:left w:type="dxa" w:w="85"/>
-              <w:bottom w:type="dxa" w:w="25"/>
-              <w:right w:type="dxa" w:w="85"/>
-            </w:tcMar>
-            <w:vAlign w:val="center"/>
-          </w:tcPr>
-          <w:p>
-            <w:pPr>
-              <w:spacing w:after="0" w:before="0" w:line="262"/>
-              <w:jc w:val="center"/>
-            </w:pPr>
-            <w:r>
-              <w:rPr>
-                <w:rFonts w:ascii="Times New Roman" w:cs="Times New Roman" w:eastAsia="Times New Roman" w:hAnsi="Times New Roman"/>
-                <w:b/>
-                <w:bCs/>
-                <w:sz w:val="23"/>
-                <w:szCs w:val="23"/>
-              </w:rPr>
-              <w:t xml:space="preserve">ĐẠI DIỆN BÊN BÁN/</w:t>
-            </w:r>
-          </w:p>
-          <w:p>
-            <w:pPr>
-              <w:spacing w:after="0" w:before="0" w:line="262"/>
-              <w:jc w:val="center"/>
-            </w:pPr>
-            <w:r>
-              <w:rPr>
-                <w:rFonts w:ascii="Times New Roman" w:cs="Times New Roman" w:eastAsia="Times New Roman" w:hAnsi="Times New Roman"/>
-                <w:b/>
-                <w:bCs/>
-                <w:sz w:val="23"/>
-                <w:szCs w:val="23"/>
-              </w:rPr>
-              <w:t xml:space="preserve">On behalf of the Seller</w:t>
-            </w:r>
-          </w:p>
-          <w:p>
-            <w:pPr>
-              <w:spacing w:after="0"/>
-            </w:pPr>
-            <w:r>
-              <w:rPr>
-                <w:rFonts w:ascii="Times New Roman" w:cs="Times New Roman" w:eastAsia="Times New Roman" w:hAnsi="Times New Roman"/>
-                <w:sz w:val="24"/>
-                <w:szCs w:val="24"/>
-              </w:rPr>
-              <w:t xml:space="preserve"/>
-            </w:r>
-          </w:p>
-          <w:p>
-            <w:pPr>
-              <w:spacing w:after="0"/>
-            </w:pPr>
-            <w:r>
-              <w:rPr>
-                <w:rFonts w:ascii="Times New Roman" w:cs="Times New Roman" w:eastAsia="Times New Roman" w:hAnsi="Times New Roman"/>
-                <w:sz w:val="24"/>
-                <w:szCs w:val="24"/>
-              </w:rPr>
-              <w:t xml:space="preserve"/>
-            </w:r>
-          </w:p>
-          <w:p>
-            <w:pPr>
-              <w:spacing w:after="0"/>
-            </w:pPr>
-            <w:r>
-              <w:rPr>
-                <w:rFonts w:ascii="Times New Roman" w:cs="Times New Roman" w:eastAsia="Times New Roman" w:hAnsi="Times New Roman"/>
-                <w:sz w:val="24"/>
-                <w:szCs w:val="24"/>
-              </w:rPr>
-              <w:t xml:space="preserve"/>
-            </w:r>
-          </w:p>
-          <w:p>
-            <w:pPr>
-              <w:spacing w:after="0"/>
-            </w:pPr>
-            <w:r>
-              <w:rPr>
-                <w:rFonts w:ascii="Times New Roman" w:cs="Times New Roman" w:eastAsia="Times New Roman" w:hAnsi="Times New Roman"/>
-                <w:sz w:val="24"/>
-                <w:szCs w:val="24"/>
-              </w:rPr>
-              <w:t xml:space="preserve"/>
-            </w:r>
-          </w:p>
-          <w:p>
-            <w:pPr>
-              <w:spacing w:after="0" w:before="0" w:line="262"/>
-              <w:jc w:val="center"/>
-            </w:pPr>
-            <w:r>
-              <w:rPr>
-                <w:rFonts w:ascii="Times New Roman" w:cs="Times New Roman" w:eastAsia="Times New Roman" w:hAnsi="Times New Roman"/>
-                <w:b/>
-                <w:bCs/>
-                <w:sz w:val="23"/>
-                <w:szCs w:val="23"/>
-              </w:rPr>
-              <w:t xml:space="preserve">{{NT_DAIDIEN_HOA}}</w:t>
-            </w:r>
-          </w:p>
-          <w:p>
-            <w:pPr>
-              <w:spacing w:after="0" w:before="0" w:line="262"/>
-              <w:jc w:val="center"/>
-            </w:pPr>
-            <w:r>
-              <w:rPr>
-                <w:rFonts w:ascii="Times New Roman" w:cs="Times New Roman" w:eastAsia="Times New Roman" w:hAnsi="Times New Roman"/>
-                <w:i/>
-                <w:iCs/>
-                <w:sz w:val="22"/>
-                <w:szCs w:val="22"/>
-              </w:rPr>
-              <w:t xml:space="preserve">{{NT_CHUCVU}}</w:t>
-            </w:r>
-          </w:p>
-        </w:tc>
-        <w:tc>
-          <w:tcPr>
-            <w:tcW w:type="dxa" w:w="4873"/>
-            <w:tcMar>
-              <w:top w:type="dxa" w:w="25"/>
-              <w:left w:type="dxa" w:w="85"/>
-              <w:bottom w:type="dxa" w:w="25"/>
-              <w:right w:type="dxa" w:w="85"/>
-            </w:tcMar>
-            <w:vAlign w:val="center"/>
-          </w:tcPr>
-          <w:p>
-            <w:pPr>
-              <w:spacing w:after="0" w:before="0" w:line="262"/>
-              <w:jc w:val="center"/>
-            </w:pPr>
-            <w:r>
-              <w:rPr>
-                <w:rFonts w:ascii="Times New Roman" w:cs="Times New Roman" w:eastAsia="Times New Roman" w:hAnsi="Times New Roman"/>
-                <w:b/>
-                <w:bCs/>
-                <w:sz w:val="23"/>
-                <w:szCs w:val="23"/>
-              </w:rPr>
-              <w:t xml:space="preserve">ĐẠI DIỆN BÊN MUA/</w:t>
-            </w:r>
-          </w:p>
-          <w:p>
-            <w:pPr>
-              <w:spacing w:after="0" w:before="0" w:line="262"/>
-              <w:jc w:val="center"/>
-            </w:pPr>
-            <w:r>
-              <w:rPr>
-                <w:rFonts w:ascii="Times New Roman" w:cs="Times New Roman" w:eastAsia="Times New Roman" w:hAnsi="Times New Roman"/>
-                <w:b/>
-                <w:bCs/>
-                <w:sz w:val="23"/>
-                <w:szCs w:val="23"/>
-              </w:rPr>
-              <w:t xml:space="preserve">On behalf of the Buyer</w:t>
-            </w:r>
-          </w:p>
-          <w:p>
-            <w:pPr>
-              <w:spacing w:after="0"/>
-            </w:pPr>
-            <w:r>
-              <w:rPr>
-                <w:rFonts w:ascii="Times New Roman" w:cs="Times New Roman" w:eastAsia="Times New Roman" w:hAnsi="Times New Roman"/>
-                <w:sz w:val="24"/>
-                <w:szCs w:val="24"/>
-              </w:rPr>
-              <w:t xml:space="preserve"/>
-            </w:r>
-          </w:p>
-          <w:p>
-            <w:pPr>
-              <w:spacing w:after="0"/>
-            </w:pPr>
-            <w:r>
-              <w:rPr>
-                <w:rFonts w:ascii="Times New Roman" w:cs="Times New Roman" w:eastAsia="Times New Roman" w:hAnsi="Times New Roman"/>
-                <w:sz w:val="24"/>
-                <w:szCs w:val="24"/>
-              </w:rPr>
-              <w:t xml:space="preserve"/>
-            </w:r>
-          </w:p>
-          <w:p>
-            <w:pPr>
-              <w:spacing w:after="0"/>
-            </w:pPr>
-            <w:r>
-              <w:rPr>
-                <w:rFonts w:ascii="Times New Roman" w:cs="Times New Roman" w:eastAsia="Times New Roman" w:hAnsi="Times New Roman"/>
-                <w:sz w:val="24"/>
-                <w:szCs w:val="24"/>
-              </w:rPr>
-              <w:t xml:space="preserve"/>
-            </w:r>
-          </w:p>
-          <w:p>
-            <w:pPr>
-              <w:spacing w:after="0"/>
-            </w:pPr>
-            <w:r>
-              <w:rPr>
-                <w:rFonts w:ascii="Times New Roman" w:cs="Times New Roman" w:eastAsia="Times New Roman" w:hAnsi="Times New Roman"/>
-                <w:sz w:val="24"/>
-                <w:szCs w:val="24"/>
-              </w:rPr>
-              <w:t xml:space="preserve"/>
-            </w:r>
-          </w:p>
-          <w:p>
-            <w:pPr>
-              <w:spacing w:after="0" w:before="0" w:line="262"/>
-              <w:jc w:val="center"/>
-            </w:pPr>
-            <w:r>
-              <w:rPr>
-                <w:rFonts w:ascii="Times New Roman" w:cs="Times New Roman" w:eastAsia="Times New Roman" w:hAnsi="Times New Roman"/>
-                <w:b/>
-                <w:bCs/>
-                <w:sz w:val="23"/>
-                <w:szCs w:val="23"/>
-              </w:rPr>
-              <w:t xml:space="preserve">{{CDT_DAIDIEN_HOA}}</w:t>
-            </w:r>
-          </w:p>
-          <w:p>
-            <w:pPr>
-              <w:spacing w:after="0" w:before="0" w:line="262"/>
-              <w:jc w:val="center"/>
-            </w:pPr>
-            <w:r>
-              <w:rPr>
-                <w:rFonts w:ascii="Times New Roman" w:cs="Times New Roman" w:eastAsia="Times New Roman" w:hAnsi="Times New Roman"/>
-                <w:i/>
-                <w:iCs/>
-                <w:sz w:val="22"/>
-                <w:szCs w:val="22"/>
-              </w:rPr>
-              <w:t xml:space="preserve">Chủ đầu tư</w:t>
-            </w:r>
-          </w:p>
-        </w:tc>
-      </w:tr>
-    </w:tbl>
+    <w:p>
+      <w:r>
+        <w:t>{{BLOCK_KY_BBG}}</w:t>
+      </w:r>
+    </w:p>
     <w:p>
       <w:pPr>
         <w:sectPr>

</xml_diff>